<commit_message>
artigo: acata revisao de 30/10 (remove secao eletrica, zona morta, tempo de mira; registra decisoes pendentes) e documentacao: adiciona cabecalho de funcionalidade em todos os documentos
</commit_message>
<xml_diff>
--- a/Docs/Documentos_Entregaveis/Artigo/artigo_revisado.docx
+++ b/Docs/Documentos_Entregaveis/Artigo/artigo_revisado.docx
@@ -667,13 +667,13 @@
         <w:t xml:space="preserve"> </w:t>
       </w:r>
       <w:r>
-        <w:t xml:space="preserve">elevado. Como alternativa, sensores acessíveis podem ser combinados de modo que as limitações de</w:t>
-      </w:r>
-      <w:r>
-        <w:t xml:space="preserve"> </w:t>
-      </w:r>
-      <w:r>
-        <w:t xml:space="preserve">um sejam compensadas pelas qualidades do outro. Sensores ultrassônicos, como o HC-SR04, medem</w:t>
+        <w:t xml:space="preserve">elevado. Como alternativa, sensores de uso convencional, sensores domésticos podem ser combinados</w:t>
+      </w:r>
+      <w:r>
+        <w:t xml:space="preserve"> </w:t>
+      </w:r>
+      <w:r>
+        <w:t xml:space="preserve">de modo que as limitações de um sejam compensadas pelas qualidades do outro. Sensores ultrassônicos, como o HC-SR04, medem</w:t>
       </w:r>
       <w:r>
         <w:t xml:space="preserve"> </w:t>
@@ -732,12 +732,6 @@
         <w:pStyle w:val="BodyText"/>
       </w:pPr>
       <w:r>
-        <w:t xml:space="preserve">Majoni et al. (2025)</w:t>
-      </w:r>
-      <w:r>
-        <w:t xml:space="preserve"> </w:t>
-      </w:r>
-      <w:r>
         <w:t xml:space="preserve">descrevem uma arquitetura em que um Arduino Mega trata o sensoriamento</w:t>
       </w:r>
       <w:r>
@@ -757,6 +751,135 @@
       </w:r>
       <w:r>
         <w:t xml:space="preserve">RadarTorres, em que o Arduino realiza a aquisição e a aplicação desktop concentra o processamento.</w:t>
+      </w:r>
+      <w:r>
+        <w:t xml:space="preserve"> </w:t>
+      </w:r>
+      <w:r>
+        <w:t xml:space="preserve">A versão de YOLO empregada no RadarTorres, porém, é mais recente que a do trabalho citado: o</w:t>
+      </w:r>
+      <w:r>
+        <w:t xml:space="preserve"> </w:t>
+      </w:r>
+      <w:r>
+        <w:t xml:space="preserve">sistema usa o</w:t>
+      </w:r>
+      <w:r>
+        <w:t xml:space="preserve"> </w:t>
+      </w:r>
+      <w:r>
+        <w:rPr>
+          <w:b/>
+          <w:bCs/>
+        </w:rPr>
+        <w:t xml:space="preserve">YOLO26n</w:t>
+      </w:r>
+      <w:r>
+        <w:t xml:space="preserve"> </w:t>
+      </w:r>
+      <w:r>
+        <w:t xml:space="preserve">(Ultralytics, nano), não o tiny-YOLOv3/v4 de gerações anteriores.</w:t>
+      </w:r>
+      <w:r>
+        <w:t xml:space="preserve"> </w:t>
+      </w:r>
+      <w:r>
+        <w:t xml:space="preserve">A diferença central é arquitetural – o YOLO26 tem cabeça de predição</w:t>
+      </w:r>
+      <w:r>
+        <w:t xml:space="preserve"> </w:t>
+      </w:r>
+      <w:r>
+        <w:rPr>
+          <w:i/>
+          <w:iCs/>
+        </w:rPr>
+        <w:t xml:space="preserve">one-to-one</w:t>
+      </w:r>
+      <w:r>
+        <w:t xml:space="preserve"> </w:t>
+      </w:r>
+      <w:r>
+        <w:t xml:space="preserve">em vez de</w:t>
+      </w:r>
+      <w:r>
+        <w:t xml:space="preserve"> </w:t>
+      </w:r>
+      <w:r>
+        <w:rPr>
+          <w:i/>
+          <w:iCs/>
+        </w:rPr>
+        <w:t xml:space="preserve">one-to-many</w:t>
+      </w:r>
+      <w:r>
+        <w:t xml:space="preserve">, de modo que cada objeto já gera uma única predição, eliminando a etapa de</w:t>
+      </w:r>
+      <w:r>
+        <w:t xml:space="preserve"> </w:t>
+      </w:r>
+      <w:r>
+        <w:rPr>
+          <w:i/>
+          <w:iCs/>
+        </w:rPr>
+        <w:t xml:space="preserve">Non-Maximum Suppression</w:t>
+      </w:r>
+      <w:r>
+        <w:t xml:space="preserve"> </w:t>
+      </w:r>
+      <w:r>
+        <w:t xml:space="preserve">(NMS) que os modelos antigos exigiam para descartar caixas</w:t>
+      </w:r>
+      <w:r>
+        <w:t xml:space="preserve"> </w:t>
+      </w:r>
+      <w:r>
+        <w:t xml:space="preserve">duplicadas. Isso remove um algoritmo</w:t>
+      </w:r>
+      <w:r>
+        <w:t xml:space="preserve"> </w:t>
+      </w:r>
+      <m:oMath>
+        <m:r>
+          <m:t>O</m:t>
+        </m:r>
+        <m:r>
+          <m:rPr>
+            <m:sty m:val="p"/>
+          </m:rPr>
+          <m:t>(</m:t>
+        </m:r>
+        <m:sSup>
+          <m:e>
+            <m:r>
+              <m:t>n</m:t>
+            </m:r>
+          </m:e>
+          <m:sup>
+            <m:r>
+              <m:t>2</m:t>
+            </m:r>
+          </m:sup>
+        </m:sSup>
+        <m:r>
+          <m:rPr>
+            <m:sty m:val="p"/>
+          </m:rPr>
+          <m:t>)</m:t>
+        </m:r>
+      </m:oMath>
+      <w:r>
+        <w:t xml:space="preserve"> </w:t>
+      </w:r>
+      <w:r>
+        <w:t xml:space="preserve">por quadro e um componente de código inteiro para</w:t>
+      </w:r>
+      <w:r>
+        <w:t xml:space="preserve"> </w:t>
+      </w:r>
+      <w:r>
+        <w:t xml:space="preserve">manter, o que foi decisivo dado que o RadarTorres roda em CPU, sem GPU dedicada garantida.</w:t>
       </w:r>
     </w:p>
     <w:p>
@@ -909,13 +1032,86 @@
         <w:t xml:space="preserve"> </w:t>
       </w:r>
       <w:r>
-        <w:t xml:space="preserve">(7 entradas, 1 camada oculta de 8 neurônios, 2 saídas, ativação</w:t>
-      </w:r>
-      <w:r>
-        <w:t xml:space="preserve"> </w:t>
-      </w:r>
-      <w:r>
-        <w:t xml:space="preserve">tanh), cujos pesos não são ajustados por retropropagação, mas evoluídos por um algoritmo genético</w:t>
+        <w:t xml:space="preserve">(sinal que só percorre a rede em um sentido, da entrada à saída,</w:t>
+      </w:r>
+      <w:r>
+        <w:t xml:space="preserve"> </w:t>
+      </w:r>
+      <w:r>
+        <w:t xml:space="preserve">sem laços de realimentação – ver detalhamento completo da arquitetura na</w:t>
+      </w:r>
+      <w:r>
+        <w:t xml:space="preserve"> </w:t>
+      </w:r>
+      <w:r>
+        <w:t xml:space="preserve">Seção </w:t>
+      </w:r>
+      <w:hyperlink w:anchor="_da5891337ffb17c529fe933ba8f5be170397a37">
+        <w:r>
+          <w:rPr>
+            <w:rStyle w:val="Hyperlink"/>
+          </w:rPr>
+          <w:t xml:space="preserve">2.3.4</w:t>
+        </w:r>
+      </w:hyperlink>
+      <w:r>
+        <w:t xml:space="preserve">) com 7 entradas, 1</w:t>
+      </w:r>
+      <w:r>
+        <w:t xml:space="preserve"> </w:t>
+      </w:r>
+      <w:r>
+        <w:t xml:space="preserve">camada oculta de 8 neurônios, 2 saídas e ativação tanh (função que comprime a soma ponderada de</w:t>
+      </w:r>
+      <w:r>
+        <w:t xml:space="preserve"> </w:t>
+      </w:r>
+      <w:r>
+        <w:t xml:space="preserve">cada neurônio no intervalo</w:t>
+      </w:r>
+      <w:r>
+        <w:t xml:space="preserve"> </w:t>
+      </w:r>
+      <m:oMath>
+        <m:r>
+          <m:rPr>
+            <m:sty m:val="p"/>
+          </m:rPr>
+          <m:t>[</m:t>
+        </m:r>
+        <m:r>
+          <m:rPr>
+            <m:sty m:val="p"/>
+          </m:rPr>
+          <m:t>−</m:t>
+        </m:r>
+        <m:r>
+          <m:t>1</m:t>
+        </m:r>
+        <m:r>
+          <m:rPr>
+            <m:sty m:val="p"/>
+          </m:rPr>
+          <m:t>,</m:t>
+        </m:r>
+        <m:r>
+          <m:t>1</m:t>
+        </m:r>
+        <m:r>
+          <m:rPr>
+            <m:sty m:val="p"/>
+          </m:rPr>
+          <m:t>]</m:t>
+        </m:r>
+      </m:oMath>
+      <w:r>
+        <w:t xml:space="preserve">). Os pesos dessa rede não são ajustados por retropropagação</w:t>
+      </w:r>
+      <w:r>
+        <w:t xml:space="preserve"> </w:t>
+      </w:r>
+      <w:r>
+        <w:t xml:space="preserve">(o método usual de treino por gradiente em redes neurais), mas evoluídos por um algoritmo genético</w:t>
       </w:r>
       <w:r>
         <w:t xml:space="preserve"> </w:t>
@@ -949,12 +1145,6 @@
         <w:t xml:space="preserve"> </w:t>
       </w:r>
       <w:r>
-        <w:t xml:space="preserve">Such et al. (2017)</w:t>
-      </w:r>
-      <w:r>
-        <w:t xml:space="preserve"> </w:t>
-      </w:r>
-      <w:r>
         <w:t xml:space="preserve">mostram que algoritmos genéticos são uma alternativa competitiva ao treino por gradiente em tarefas</w:t>
       </w:r>
       <w:r>
@@ -967,7 +1157,79 @@
         <w:t xml:space="preserve"> </w:t>
       </w:r>
       <w:r>
-        <w:t xml:space="preserve">de parâmetros, contra os 82 parâmetros da rede do RadarTorres). Esse resultado sustenta a escolha</w:t>
+        <w:t xml:space="preserve">de parâmetros, contra os 82 parâmetros da rede do RadarTorres). Na mesma direção,</w:t>
+      </w:r>
+      <w:r>
+        <w:t xml:space="preserve"> </w:t>
+      </w:r>
+      <w:r>
+        <w:t xml:space="preserve">mostram que estratégias de evolução – também livres de gradiente e</w:t>
+      </w:r>
+      <w:r>
+        <w:t xml:space="preserve"> </w:t>
+      </w:r>
+      <w:r>
+        <w:t xml:space="preserve">baseadas apenas na avaliação do retorno de episódios completos – competem com métodos de gradiente</w:t>
+      </w:r>
+      <w:r>
+        <w:t xml:space="preserve"> </w:t>
+      </w:r>
+      <w:r>
+        <w:t xml:space="preserve">de política em tarefas contínuas de controle, com a vantagem de dispensarem retropropagação,</w:t>
+      </w:r>
+      <w:r>
+        <w:t xml:space="preserve"> </w:t>
+      </w:r>
+      <w:r>
+        <w:t xml:space="preserve">diferenciabilidade da recompensa e atribuição temporal de crédito. São exatamente essas três</w:t>
+      </w:r>
+      <w:r>
+        <w:t xml:space="preserve"> </w:t>
+      </w:r>
+      <w:r>
+        <w:t xml:space="preserve">dispensas que tornam o método aplicável ao RadarTorres, cujo sinal de desempenho (alvo abatido ou</w:t>
+      </w:r>
+      <w:r>
+        <w:t xml:space="preserve"> </w:t>
+      </w:r>
+      <w:r>
+        <w:t xml:space="preserve">alvo que escapa) só se materializa ao final do episódio simulado e não é diferenciável em relação</w:t>
+      </w:r>
+      <w:r>
+        <w:t xml:space="preserve"> </w:t>
+      </w:r>
+      <w:r>
+        <w:t xml:space="preserve">aos pesos da rede. O emprego de neuroevolução para controlar agentes em ambientes de decisão tática</w:t>
+      </w:r>
+      <w:r>
+        <w:t xml:space="preserve"> </w:t>
+      </w:r>
+      <w:r>
+        <w:t xml:space="preserve">com múltiplas entidades, aliás, é um domínio consolidado:</w:t>
+      </w:r>
+      <w:r>
+        <w:t xml:space="preserve"> </w:t>
+      </w:r>
+      <w:r>
+        <w:t xml:space="preserve">revisam o estado da arte da neuroevolução em jogos e identificam, entre seus usos mais</w:t>
+      </w:r>
+      <w:r>
+        <w:t xml:space="preserve"> </w:t>
+      </w:r>
+      <w:r>
+        <w:t xml:space="preserve">estabelecidos, precisamente a evolução de controladores de comportamento avaliados por simulação</w:t>
+      </w:r>
+      <w:r>
+        <w:t xml:space="preserve"> </w:t>
+      </w:r>
+      <w:r>
+        <w:t xml:space="preserve">episódica – o papel desempenhado pela rede do RadarTorres na seleção de torre. Esse conjunto de</w:t>
+      </w:r>
+      <w:r>
+        <w:t xml:space="preserve"> </w:t>
+      </w:r>
+      <w:r>
+        <w:t xml:space="preserve">resultados sustenta a escolha</w:t>
       </w:r>
       <w:r>
         <w:t xml:space="preserve"> </w:t>
@@ -1039,19 +1301,7 @@
         <w:t xml:space="preserve">action masking</w:t>
       </w:r>
       <w:r>
-        <w:t xml:space="preserve">):</w:t>
-      </w:r>
-      <w:r>
-        <w:t xml:space="preserve"> </w:t>
-      </w:r>
-      <w:r>
-        <w:t xml:space="preserve">Huang and Ontañón (2020)</w:t>
-      </w:r>
-      <w:r>
-        <w:t xml:space="preserve"> </w:t>
-      </w:r>
-      <w:r>
-        <w:t xml:space="preserve">mostram, para algoritmos de</w:t>
+        <w:t xml:space="preserve">): mostram, para algoritmos de</w:t>
       </w:r>
       <w:r>
         <w:t xml:space="preserve"> </w:t>
@@ -1094,19 +1344,7 @@
         <w:t xml:space="preserve">shielding</w:t>
       </w:r>
       <w:r>
-        <w:t xml:space="preserve">:</w:t>
-      </w:r>
-      <w:r>
-        <w:t xml:space="preserve"> </w:t>
-      </w:r>
-      <w:r>
-        <w:t xml:space="preserve">Alshiekh et al. (2017)</w:t>
-      </w:r>
-      <w:r>
-        <w:t xml:space="preserve"> </w:t>
-      </w:r>
-      <w:r>
-        <w:t xml:space="preserve">propõem</w:t>
+        <w:t xml:space="preserve">: propõem</w:t>
       </w:r>
       <w:r>
         <w:t xml:space="preserve"> </w:t>
@@ -1302,6 +1540,271 @@
       </w:r>
       <w:r>
         <w:t xml:space="preserve">hardware físico real.</w:t>
+      </w:r>
+    </w:p>
+    <w:p>
+      <w:pPr>
+        <w:pStyle w:val="BodyText"/>
+      </w:pPr>
+      <w:r>
+        <w:t xml:space="preserve">A classificação do alvo pelo módulo de visão – por cor, formato e tamanho – apoia-se em três</w:t>
+      </w:r>
+      <w:r>
+        <w:t xml:space="preserve"> </w:t>
+      </w:r>
+      <w:r>
+        <w:t xml:space="preserve">técnicas clássicas de visão computacional, cada uma correspondendo a um dos três atributos. A</w:t>
+      </w:r>
+      <w:r>
+        <w:t xml:space="preserve"> </w:t>
+      </w:r>
+      <w:r>
+        <w:t xml:space="preserve">identificação por</w:t>
+      </w:r>
+      <w:r>
+        <w:t xml:space="preserve"> </w:t>
+      </w:r>
+      <w:r>
+        <w:rPr>
+          <w:b/>
+          <w:bCs/>
+        </w:rPr>
+        <w:t xml:space="preserve">cor</w:t>
+      </w:r>
+      <w:r>
+        <w:t xml:space="preserve"> </w:t>
+      </w:r>
+      <w:r>
+        <w:t xml:space="preserve">segue o princípio estabelecido por</w:t>
+      </w:r>
+      <w:r>
+        <w:t xml:space="preserve"> </w:t>
+      </w:r>
+      <w:r>
+        <w:t xml:space="preserve">: um objeto pode ser reconhecido pelo histograma de sua</w:t>
+      </w:r>
+      <w:r>
+        <w:t xml:space="preserve"> </w:t>
+      </w:r>
+      <w:r>
+        <w:t xml:space="preserve">distribuição de cores, que é robusto a mudanças de orientação, a oclusões parciais e a variações</w:t>
+      </w:r>
+      <w:r>
+        <w:t xml:space="preserve"> </w:t>
+      </w:r>
+      <w:r>
+        <w:t xml:space="preserve">de escala justamente porque descarta a informação espacial dos pixels. É esse resultado que</w:t>
+      </w:r>
+      <w:r>
+        <w:t xml:space="preserve"> </w:t>
+      </w:r>
+      <w:r>
+        <w:t xml:space="preserve">sustenta a assinatura adotada no RadarTorres, composta por um histograma de matiz e saturação do</w:t>
+      </w:r>
+      <w:r>
+        <w:t xml:space="preserve"> </w:t>
+      </w:r>
+      <w:r>
+        <w:t xml:space="preserve">objeto de referência – a escolha de matiz e saturação, em vez dos canais RGB, isola a</w:t>
+      </w:r>
+      <w:r>
+        <w:t xml:space="preserve"> </w:t>
+      </w:r>
+      <w:r>
+        <w:t xml:space="preserve">cromaticidade da intensidade luminosa e reduz a sensibilidade do reconhecimento à iluminação do</w:t>
+      </w:r>
+      <w:r>
+        <w:t xml:space="preserve"> </w:t>
+      </w:r>
+      <w:r>
+        <w:t xml:space="preserve">ambiente. A classificação por</w:t>
+      </w:r>
+      <w:r>
+        <w:t xml:space="preserve"> </w:t>
+      </w:r>
+      <w:r>
+        <w:rPr>
+          <w:b/>
+          <w:bCs/>
+        </w:rPr>
+        <w:t xml:space="preserve">formato</w:t>
+      </w:r>
+      <w:r>
+        <w:t xml:space="preserve">, por sua vez, remete aos momentos invariantes de</w:t>
+      </w:r>
+      <w:r>
+        <w:t xml:space="preserve"> </w:t>
+      </w:r>
+      <w:r>
+        <w:t xml:space="preserve">, que demonstrou ser possível derivar, a partir dos momentos de uma</w:t>
+      </w:r>
+      <w:r>
+        <w:t xml:space="preserve"> </w:t>
+      </w:r>
+      <w:r>
+        <w:t xml:space="preserve">região binária, um conjunto de descritores cujo valor não se altera sob translação, rotação ou</w:t>
+      </w:r>
+      <w:r>
+        <w:t xml:space="preserve"> </w:t>
+      </w:r>
+      <w:r>
+        <w:t xml:space="preserve">mudança de escala – propriedade indispensável quando o mesmo alvo é observado por câmeras de</w:t>
+      </w:r>
+      <w:r>
+        <w:t xml:space="preserve"> </w:t>
+      </w:r>
+      <w:r>
+        <w:t xml:space="preserve">quadrantes distintos, a distâncias diferentes. Já o</w:t>
+      </w:r>
+      <w:r>
+        <w:t xml:space="preserve"> </w:t>
+      </w:r>
+      <w:r>
+        <w:rPr>
+          <w:b/>
+          <w:bCs/>
+        </w:rPr>
+        <w:t xml:space="preserve">tamanho</w:t>
+      </w:r>
+      <w:r>
+        <w:t xml:space="preserve"> </w:t>
+      </w:r>
+      <w:r>
+        <w:t xml:space="preserve">é tratado como um descritor de</w:t>
+      </w:r>
+      <w:r>
+        <w:t xml:space="preserve"> </w:t>
+      </w:r>
+      <w:r>
+        <w:t xml:space="preserve">região no sentido de , medido em área de pixels da região segmentada e</w:t>
+      </w:r>
+      <w:r>
+        <w:t xml:space="preserve"> </w:t>
+      </w:r>
+      <w:r>
+        <w:t xml:space="preserve">só interpretável como grandeza física quando combinado à distância informada pelos sensores</w:t>
+      </w:r>
+      <w:r>
+        <w:t xml:space="preserve"> </w:t>
+      </w:r>
+      <w:r>
+        <w:t xml:space="preserve">ultrassônicos – razão pela qual ele opera, no protótipo, como critério de desempate entre</w:t>
+      </w:r>
+      <w:r>
+        <w:t xml:space="preserve"> </w:t>
+      </w:r>
+      <w:r>
+        <w:t xml:space="preserve">candidatas, e não como medida absoluta.</w:t>
+      </w:r>
+    </w:p>
+    <w:p>
+      <w:pPr>
+        <w:pStyle w:val="BodyText"/>
+      </w:pPr>
+      <w:r>
+        <w:t xml:space="preserve">A proposição das regiões candidatas que alimentam essas três comparações é delegada a um detector</w:t>
+      </w:r>
+      <w:r>
+        <w:t xml:space="preserve"> </w:t>
+      </w:r>
+      <w:r>
+        <w:t xml:space="preserve">de objetos de estágio único: o RadarTorres executa localmente o modelo YOLO26, na variante</w:t>
+      </w:r>
+      <w:r>
+        <w:t xml:space="preserve"> </w:t>
+      </w:r>
+      <w:r>
+        <w:rPr>
+          <w:i/>
+          <w:iCs/>
+        </w:rPr>
+        <w:t xml:space="preserve">nano</w:t>
+      </w:r>
+      <w:r>
+        <w:t xml:space="preserve">, exportado para o formato ONNX</w:t>
+      </w:r>
+      <w:r>
+        <w:t xml:space="preserve"> </w:t>
+      </w:r>
+      <w:r>
+        <w:t xml:space="preserve">(Ultralytics 2025)</w:t>
+      </w:r>
+      <w:r>
+        <w:t xml:space="preserve">. A divisão de papéis é</w:t>
+      </w:r>
+      <w:r>
+        <w:t xml:space="preserve"> </w:t>
+      </w:r>
+      <w:r>
+        <w:t xml:space="preserve">deliberada: o detector resolve o problema de</w:t>
+      </w:r>
+      <w:r>
+        <w:t xml:space="preserve"> </w:t>
+      </w:r>
+      <w:r>
+        <w:rPr>
+          <w:i/>
+          <w:iCs/>
+        </w:rPr>
+        <w:t xml:space="preserve">onde</w:t>
+      </w:r>
+      <w:r>
+        <w:t xml:space="preserve"> </w:t>
+      </w:r>
+      <w:r>
+        <w:t xml:space="preserve">há objetos no quadro, tarefa para a qual</w:t>
+      </w:r>
+      <w:r>
+        <w:t xml:space="preserve"> </w:t>
+      </w:r>
+      <w:r>
+        <w:t xml:space="preserve">um modelo treinado em grande escala é superior a qualquer heurística manual, enquanto a decisão de</w:t>
+      </w:r>
+      <w:r>
+        <w:t xml:space="preserve"> </w:t>
+      </w:r>
+      <w:r>
+        <w:rPr>
+          <w:i/>
+          <w:iCs/>
+        </w:rPr>
+        <w:t xml:space="preserve">qual</w:t>
+      </w:r>
+      <w:r>
+        <w:t xml:space="preserve"> </w:t>
+      </w:r>
+      <w:r>
+        <w:t xml:space="preserve">daqueles objetos corresponde ao perfil cadastrado permanece com as três técnicas</w:t>
+      </w:r>
+      <w:r>
+        <w:t xml:space="preserve"> </w:t>
+      </w:r>
+      <w:r>
+        <w:t xml:space="preserve">clássicas acima, auditáveis e ajustáveis pelo operador sem necessidade de retreinamento. Essa</w:t>
+      </w:r>
+      <w:r>
+        <w:t xml:space="preserve"> </w:t>
+      </w:r>
+      <w:r>
+        <w:t xml:space="preserve">escolha também preserva o comportamento degradado do sistema: quando o detector não propõe nenhuma</w:t>
+      </w:r>
+      <w:r>
+        <w:t xml:space="preserve"> </w:t>
+      </w:r>
+      <w:r>
+        <w:t xml:space="preserve">caixa compatível com a cor do perfil, a proposição de candidatas recai sobre segmentação de cor</w:t>
+      </w:r>
+      <w:r>
+        <w:t xml:space="preserve"> </w:t>
+      </w:r>
+      <w:r>
+        <w:t xml:space="preserve">direta, de modo que a falha do modelo neural reduz a qualidade da detecção, mas não interrompe o</w:t>
+      </w:r>
+      <w:r>
+        <w:t xml:space="preserve"> </w:t>
+      </w:r>
+      <w:r>
+        <w:t xml:space="preserve">funcionamento do módulo.</w:t>
       </w:r>
     </w:p>
     <w:p>
@@ -2542,9 +3045,9 @@
       <w:pPr>
         <w:pStyle w:val="Heading3"/>
       </w:pPr>
-      <w:bookmarkStart w:id="22" w:name="_488394aad8ea45772d7cece40e270ef1d752a05"/>
-      <w:r>
-        <w:t xml:space="preserve">Projeto elétrico e estrutural</w:t>
+      <w:bookmarkStart w:id="22" w:name="_6341aa5be01adf096e23a08770d38dec7f9054f"/>
+      <w:r>
+        <w:t xml:space="preserve">Módulo de visão</w:t>
       </w:r>
       <w:bookmarkEnd w:id="22"/>
     </w:p>
@@ -2553,517 +3056,269 @@
         <w:pStyle w:val="FirstParagraph"/>
       </w:pPr>
       <w:r>
-        <w:t xml:space="preserve">O projeto elétrico é baseado em um Arduino MEGA 2560 (ATmega2560, lógica 5V) – substituiu um Arduino</w:t>
-      </w:r>
-      <w:r>
-        <w:t xml:space="preserve"> </w:t>
-      </w:r>
-      <w:r>
-        <w:t xml:space="preserve">Uno considerado em versão anterior do projeto, cujos</w:t>
-      </w:r>
-      <w:r>
-        <w:t xml:space="preserve"> </w:t>
-      </w:r>
-      <m:oMath>
-        <m:r>
-          <m:rPr>
-            <m:sty m:val="p"/>
-          </m:rPr>
-          <m:t>∼</m:t>
-        </m:r>
-        <m:r>
-          <m:t>20</m:t>
-        </m:r>
-      </m:oMath>
-      <w:r>
-        <w:t xml:space="preserve"> </w:t>
-      </w:r>
-      <w:r>
-        <w:t xml:space="preserve">pinos não comportam os 13 motores de</w:t>
-      </w:r>
-      <w:r>
-        <w:t xml:space="preserve"> </w:t>
-      </w:r>
-      <w:r>
-        <w:t xml:space="preserve">passo da topologia atual. A varredura da torre central é feita por um motor de passo 28BYJ-48</w:t>
-      </w:r>
-      <w:r>
-        <w:t xml:space="preserve"> </w:t>
-      </w:r>
-      <w:r>
-        <w:t xml:space="preserve">acionado por um driver ULN2003; os outros nove eixos de mira (oito das quatro câmeras, em pan e</w:t>
-      </w:r>
-      <w:r>
-        <w:t xml:space="preserve"> </w:t>
-      </w:r>
-      <w:r>
-        <w:t xml:space="preserve">tilt, e quatro das torres armadas, só em pan) usam motores de passo NEMA17 com drivers</w:t>
-      </w:r>
-      <w:r>
-        <w:t xml:space="preserve"> </w:t>
-      </w:r>
-      <w:r>
-        <w:t xml:space="preserve">A4988/DRV8825, com um pino de habilitação (</w:t>
+        <w:t xml:space="preserve">O módulo de visão utiliza</w:t>
+      </w:r>
+      <w:r>
+        <w:t xml:space="preserve"> </w:t>
+      </w:r>
+      <w:r>
+        <w:t xml:space="preserve">quatro câmeras de 720p</w:t>
+      </w:r>
+      <w:r>
+        <w:t xml:space="preserve"> </w:t>
+      </w:r>
+      <w:r>
+        <w:t xml:space="preserve">conectadas por USB ao computador, associadas aos</w:t>
+      </w:r>
+      <w:r>
+        <w:t xml:space="preserve"> </w:t>
+      </w:r>
+      <w:r>
+        <w:t xml:space="preserve">quadrantes do radar, e processa os quadros de vídeo (</w:t>
       </w:r>
       <w:r>
         <w:rPr>
           <w:i/>
           <w:iCs/>
         </w:rPr>
-        <w:t xml:space="preserve">enable</w:t>
-      </w:r>
-      <w:r>
-        <w:t xml:space="preserve">) compartilhado entre os doze drivers.</w:t>
-      </w:r>
-      <w:r>
-        <w:t xml:space="preserve"> </w:t>
-      </w:r>
-      <w:r>
-        <w:t xml:space="preserve">Cada uma das quatro torres armadas possui, portanto, um único motor de pan (modelo 2D, sem tilt na</w:t>
-      </w:r>
-      <w:r>
-        <w:t xml:space="preserve"> </w:t>
-      </w:r>
-      <w:r>
-        <w:t xml:space="preserve">torre) e um laser de baixa potência como acionamento demonstrativo, sem indicador luminoso dedicado</w:t>
-      </w:r>
-      <w:r>
-        <w:t xml:space="preserve"> </w:t>
-      </w:r>
-      <w:r>
-        <w:t xml:space="preserve">– a torre selecionada e o evento de disparo são sinalizados apenas via protocolo serial (mensagens</w:t>
-      </w:r>
-      <w:r>
-        <w:t xml:space="preserve"> </w:t>
-      </w:r>
-      <w:r>
-        <w:rPr>
-          <w:rStyle w:val="VerbatimChar"/>
-        </w:rPr>
-        <w:t xml:space="preserve">ACK</w:t>
-      </w:r>
-      <w:r>
-        <w:t xml:space="preserve">/</w:t>
-      </w:r>
-      <w:r>
-        <w:rPr>
-          <w:rStyle w:val="VerbatimChar"/>
-        </w:rPr>
-        <w:t xml:space="preserve">STATUS</w:t>
-      </w:r>
-      <w:r>
-        <w:t xml:space="preserve">), não por LED. A alimentação dos doze drivers A4988/DRV8825 e do</w:t>
-      </w:r>
-      <w:r>
-        <w:t xml:space="preserve"> </w:t>
-      </w:r>
-      <w:r>
-        <w:t xml:space="preserve">ULN2003 (tensão e distribuição de terra) ainda não está especificada no firmware e permanece como</w:t>
-      </w:r>
-      <w:r>
-        <w:t xml:space="preserve"> </w:t>
-      </w:r>
-      <w:r>
-        <w:t xml:space="preserve">item a confirmar na montagem física. Na torre central, o mastro dos sensores não é acoplado</w:t>
-      </w:r>
-      <w:r>
-        <w:t xml:space="preserve"> </w:t>
-      </w:r>
-      <w:r>
-        <w:t xml:space="preserve">diretamente ao eixo do motor: ele assenta em um disco que gira sobre um rolamento axial 51108,</w:t>
-      </w:r>
-      <w:r>
-        <w:t xml:space="preserve"> </w:t>
-      </w:r>
-      <w:r>
-        <w:t xml:space="preserve">acionado pelo motor por um cubo duplo-D. A passagem dos fios fica próxima ao eixo central, com folga</w:t>
-      </w:r>
-      <w:r>
-        <w:t xml:space="preserve"> </w:t>
-      </w:r>
-      <w:r>
-        <w:t xml:space="preserve">de cabo em vez de anel coletor (</w:t>
-      </w:r>
-      <w:r>
-        <w:rPr>
-          <w:i/>
-          <w:iCs/>
-        </w:rPr>
-        <w:t xml:space="preserve">slip ring</w:t>
-      </w:r>
-      <w:r>
-        <w:t xml:space="preserve">), já que o giro é limitado a 180°. A torre</w:t>
-      </w:r>
-      <w:r>
-        <w:t xml:space="preserve"> </w:t>
-      </w:r>
-      <w:r>
-        <w:t xml:space="preserve">central é cerca de 5 cm mais alta que as torres armadas (cerca de 137,5 mm de altura). As peças</w:t>
-      </w:r>
-      <w:r>
-        <w:t xml:space="preserve"> </w:t>
-      </w:r>
-      <w:r>
-        <w:t xml:space="preserve">estruturais são impressas em 3D, em formato de torre, com suporte para rolamento axial na base –</w:t>
-      </w:r>
-      <w:r>
-        <w:t xml:space="preserve"> </w:t>
-      </w:r>
-      <w:r>
-        <w:t xml:space="preserve">o que permite a rotação da estrutura –, comum às cinco torres. As torres armadas têm, além disso,</w:t>
-      </w:r>
-      <w:r>
-        <w:t xml:space="preserve"> </w:t>
-      </w:r>
-      <w:r>
-        <w:t xml:space="preserve">suportes próprios para o motor de pan e para as câmeras; a torre central tem suporte próprio para os</w:t>
-      </w:r>
-      <w:r>
-        <w:t xml:space="preserve"> </w:t>
-      </w:r>
-      <w:r>
-        <w:t xml:space="preserve">sensores ultrassônicos no topo do mastro. Todas essas peças, assim como o restante do projeto,</w:t>
-      </w:r>
-      <w:r>
-        <w:t xml:space="preserve"> </w:t>
-      </w:r>
-      <w:r>
-        <w:t xml:space="preserve">existem até o momento apenas em projeto digital (modelagem 3D e simulação elétrica), sem montagem</w:t>
-      </w:r>
-      <w:r>
-        <w:t xml:space="preserve"> </w:t>
-      </w:r>
-      <w:r>
-        <w:t xml:space="preserve">física realizada.</w:t>
+        <w:t xml:space="preserve">frames</w:t>
+      </w:r>
+      <w:r>
+        <w:t xml:space="preserve">) para</w:t>
+      </w:r>
+      <w:r>
+        <w:t xml:space="preserve"> </w:t>
+      </w:r>
+      <w:r>
+        <w:t xml:space="preserve">classificar o alvo por</w:t>
+      </w:r>
+      <w:r>
+        <w:t xml:space="preserve"> </w:t>
+      </w:r>
+      <w:r>
+        <w:t xml:space="preserve">sua cor, formato e tamanho</w:t>
+      </w:r>
+      <w:r>
+        <w:t xml:space="preserve">. Cada quadro capturado é entregue já decodificado à detecção, que executa</w:t>
+      </w:r>
+      <w:r>
+        <w:t xml:space="preserve"> </w:t>
+      </w:r>
+      <w:r>
+        <w:t xml:space="preserve">localmente um modelo YOLO26, na variante nano, em formato ONNX, para propor as regiões candidatas</w:t>
+      </w:r>
+      <w:r>
+        <w:t xml:space="preserve"> </w:t>
+      </w:r>
+      <w:r>
+        <w:t xml:space="preserve">da imagem. Cada</w:t>
+      </w:r>
+      <w:r>
+        <w:t xml:space="preserve"> </w:t>
+      </w:r>
+      <w:r>
+        <w:t xml:space="preserve">candidata é então comparada ao perfil do alvo previamente cadastrado – definido por cor, formato e</w:t>
+      </w:r>
+      <w:r>
+        <w:t xml:space="preserve"> </w:t>
+      </w:r>
+      <w:r>
+        <w:t xml:space="preserve">tamanho, e opcionalmente por fotos de referência recortadas no objeto de interesse. Havendo foto de</w:t>
+      </w:r>
+      <w:r>
+        <w:t xml:space="preserve"> </w:t>
+      </w:r>
+      <w:r>
+        <w:t xml:space="preserve">referência, a comparação combina um histograma de matiz e saturação com uma grade espacial de cor</w:t>
+      </w:r>
+      <w:r>
+        <w:t xml:space="preserve"> </w:t>
+      </w:r>
+      <w:r>
+        <w:t xml:space="preserve">média, usados como assinatura do objeto; na ausência de foto, o critério recai sobre a fração de</w:t>
+      </w:r>
+      <w:r>
+        <w:t xml:space="preserve"> </w:t>
+      </w:r>
+      <w:r>
+        <w:t xml:space="preserve">pixels com a cor cadastrada e sobre a classificação de formato – reconhecer o alvo apenas pelo</w:t>
+      </w:r>
+      <w:r>
+        <w:t xml:space="preserve"> </w:t>
+      </w:r>
+      <w:r>
+        <w:t xml:space="preserve">formato, sem depender de uma cor cadastrada, fica como passo futuro. Quando o detector não propõe nenhuma</w:t>
+      </w:r>
+      <w:r>
+        <w:t xml:space="preserve"> </w:t>
+      </w:r>
+      <w:r>
+        <w:t xml:space="preserve">caixa com a cor do perfil, as regiões candidatas passam a ser propostas por segmentação de cor, como</w:t>
+      </w:r>
+      <w:r>
+        <w:t xml:space="preserve"> </w:t>
+      </w:r>
+      <w:r>
+        <w:t xml:space="preserve">último recurso na ordenação de candidatos.</w:t>
       </w:r>
     </w:p>
     <w:p>
       <w:pPr>
+        <w:pStyle w:val="BodyText"/>
+      </w:pPr>
+      <w:r>
+        <w:t xml:space="preserve">O envio das informações resultantes ao Arduino, para guiar o apontamento da torre (movimentos de pan</w:t>
+      </w:r>
+      <w:r>
+        <w:t xml:space="preserve"> </w:t>
+      </w:r>
+      <w:r>
+        <w:t xml:space="preserve">e tilt), foi projetado mas ainda não está implementado: o protocolo serial atual não possui comando</w:t>
+      </w:r>
+      <w:r>
+        <w:t xml:space="preserve"> </w:t>
+      </w:r>
+      <w:r>
+        <w:t xml:space="preserve">de apontamento, e a fusão entre a posição estimada pela visão e a distância medida pelos sensores</w:t>
+      </w:r>
+      <w:r>
+        <w:t xml:space="preserve"> </w:t>
+      </w:r>
+      <w:r>
+        <w:t xml:space="preserve">ultrassônicos permanece como etapa planejada. Como o hardware ainda não foi montado, a validação</w:t>
+      </w:r>
+      <w:r>
+        <w:t xml:space="preserve"> </w:t>
+      </w:r>
+      <w:r>
+        <w:t xml:space="preserve">funcional descrita neste trabalho foi feita por simulação, e nenhum resultado de campo é relatado.</w:t>
+      </w:r>
+    </w:p>
+    <w:p>
+      <w:pPr>
+        <w:pStyle w:val="Heading3"/>
+      </w:pPr>
+      <w:bookmarkStart w:id="23" w:name="_6fbb6364af1dc3569e882d01e930d8dd3360f73"/>
+      <w:r>
+        <w:t xml:space="preserve">Fluxo operacional</w:t>
+      </w:r>
+      <w:bookmarkEnd w:id="23"/>
+    </w:p>
+    <w:p>
+      <w:pPr>
+        <w:pStyle w:val="FirstParagraph"/>
+      </w:pPr>
+      <w:r>
+        <w:t xml:space="preserve">Em operação, o sistema segue estas etapas: (1) o Arduino varre o ambiente com os dois sensores</w:t>
+      </w:r>
+      <w:r>
+        <w:t xml:space="preserve"> </w:t>
+      </w:r>
+      <w:r>
+        <w:t xml:space="preserve">ultrassônicos e envia ângulo e distância à aplicação; (2) a aplicação converte cada leitura em</w:t>
+      </w:r>
+      <w:r>
+        <w:t xml:space="preserve"> </w:t>
+      </w:r>
+      <w:r>
+        <w:t xml:space="preserve">posição cartesiana, determina o quadrante, exibe o alvo no radar e registra a detecção; (3) em</w:t>
+      </w:r>
+      <w:r>
+        <w:t xml:space="preserve"> </w:t>
+      </w:r>
+      <w:r>
+        <w:t xml:space="preserve">paralelo, as câmeras fornecem quadros de vídeo, e o módulo de visão classifica o alvo por cor,</w:t>
+      </w:r>
+      <w:r>
+        <w:t xml:space="preserve"> </w:t>
+      </w:r>
+      <w:r>
+        <w:t xml:space="preserve">formato e tamanho; (4) a aplicação seleciona, entre as torres armadas disponíveis, a mais adequada</w:t>
+      </w:r>
+      <w:r>
+        <w:t xml:space="preserve"> </w:t>
+      </w:r>
+      <w:r>
+        <w:t xml:space="preserve">para o alvo, priorizando as do mesmo quadrante e, entre elas, a de menor distância euclidiana (por</w:t>
+      </w:r>
+      <w:r>
+        <w:t xml:space="preserve"> </w:t>
+      </w:r>
+      <w:r>
+        <w:t xml:space="preserve">proximidade, alvo a alvo); (5) o comando é enviado ao Arduino, que aciona a torre selecionada;</w:t>
+      </w:r>
+      <w:r>
+        <w:t xml:space="preserve"> </w:t>
+      </w:r>
+      <w:r>
+        <w:t xml:space="preserve">(6) o acionamento demonstrativo (laser de baixa potência ou LED) só ocorre respeitando a distância</w:t>
+      </w:r>
+      <w:r>
+        <w:t xml:space="preserve"> </w:t>
+      </w:r>
+      <w:r>
+        <w:t xml:space="preserve">mínima de segurança e as demais regras de segurança configuráveis do sistema; (7) toda ação</w:t>
+      </w:r>
+      <w:r>
+        <w:t xml:space="preserve"> </w:t>
+      </w:r>
+      <w:r>
+        <w:t xml:space="preserve">executada é registrada em auditoria.</w:t>
+      </w:r>
+    </w:p>
+    <w:p>
+      <w:pPr>
+        <w:pStyle w:val="BodyText"/>
+      </w:pPr>
+      <w:r>
+        <w:t xml:space="preserve">A seleção de torre e o acionamento dependem do modo de operação escolhido pelo operador, em um</w:t>
+      </w:r>
+      <w:r>
+        <w:t xml:space="preserve"> </w:t>
+      </w:r>
+      <w:r>
+        <w:t xml:space="preserve">modelo de três níveis: no primeiro, os alvos são apenas detectados e exibidos; no segundo,</w:t>
+      </w:r>
+      <w:r>
+        <w:t xml:space="preserve"> </w:t>
+      </w:r>
+      <w:r>
+        <w:t xml:space="preserve">acrescenta-se a seleção automática da torre, sem acionamento; no terceiro, acrescenta-se o</w:t>
+      </w:r>
+      <w:r>
+        <w:t xml:space="preserve"> </w:t>
+      </w:r>
+      <w:r>
+        <w:t xml:space="preserve">acionamento demonstrativo automático. Quando a regra de segurança reprova um acionamento, ele é</w:t>
+      </w:r>
+      <w:r>
+        <w:t xml:space="preserve"> </w:t>
+      </w:r>
+      <w:r>
+        <w:t xml:space="preserve">bloqueado e o motivo é registrado no console de eventos.</w:t>
+      </w:r>
+    </w:p>
+    <w:p>
+      <w:pPr>
         <w:pStyle w:val="CaptionedFigure"/>
       </w:pPr>
       <w:r>
         <w:drawing>
           <wp:inline>
-            <wp:extent cx="5334000" cy="3606328"/>
+            <wp:extent cx="911225" cy="4373880"/>
             <wp:effectExtent b="0" l="0" r="0" t="0"/>
-            <wp:docPr descr="" title="" id="24" name="Picture"/>
+            <wp:docPr descr="" title="" id="25" name="Picture"/>
             <a:graphic>
               <a:graphicData uri="http://schemas.openxmlformats.org/drawingml/2006/picture">
                 <pic:pic>
                   <pic:nvPicPr>
-                    <pic:cNvPr descr="maquete_torres_isometrica.png" id="25" name="Picture"/>
+                    <pic:cNvPr descr="Fluxo_Operacional.png" id="26" name="Picture"/>
                     <pic:cNvPicPr>
                       <a:picLocks noChangeArrowheads="1" noChangeAspect="1"/>
                     </pic:cNvPicPr>
                   </pic:nvPicPr>
                   <pic:blipFill>
-                    <a:blip r:embed="rId23"/>
-                    <a:stretch>
-                      <a:fillRect/>
-                    </a:stretch>
-                  </pic:blipFill>
-                  <pic:spPr bwMode="auto">
-                    <a:xfrm>
-                      <a:off x="0" y="0"/>
-                      <a:ext cx="5334000" cy="3606328"/>
-                    </a:xfrm>
-                    <a:prstGeom prst="rect">
-                      <a:avLst/>
-                    </a:prstGeom>
-                    <a:noFill/>
-                    <a:ln w="9525">
-                      <a:noFill/>
-                      <a:headEnd/>
-                      <a:tailEnd/>
-                    </a:ln>
-                  </pic:spPr>
-                </pic:pic>
-              </a:graphicData>
-            </a:graphic>
-          </wp:inline>
-        </w:drawing>
-      </w:r>
-    </w:p>
-    <w:p>
-      <w:pPr>
-        <w:pStyle w:val="ImageCaption"/>
-      </w:pPr>
-      <w:r>
-        <w:t xml:space="preserve">Maquete conceitual do arranjo das cinco torres (vista isométrica): quatro torres de disparo e a torre central com varredura de 360° (dos autores).</w:t>
-      </w:r>
-    </w:p>
-    <w:p>
-      <w:pPr>
-        <w:pStyle w:val="Heading3"/>
-      </w:pPr>
-      <w:bookmarkStart w:id="26" w:name="_6341aa5be01adf096e23a08770d38dec7f9054f"/>
-      <w:r>
-        <w:t xml:space="preserve">Módulo de visão</w:t>
-      </w:r>
-      <w:bookmarkEnd w:id="26"/>
-    </w:p>
-    <w:p>
-      <w:pPr>
-        <w:pStyle w:val="FirstParagraph"/>
-      </w:pPr>
-      <w:r>
-        <w:t xml:space="preserve">O módulo de visão utiliza</w:t>
-      </w:r>
-      <w:r>
-        <w:t xml:space="preserve"> </w:t>
-      </w:r>
-      <w:r>
-        <w:t xml:space="preserve">quatro câmeras de 720p</w:t>
-      </w:r>
-      <w:r>
-        <w:t xml:space="preserve"> </w:t>
-      </w:r>
-      <w:r>
-        <w:t xml:space="preserve">conectadas por USB ao computador, associadas aos</w:t>
-      </w:r>
-      <w:r>
-        <w:t xml:space="preserve"> </w:t>
-      </w:r>
-      <w:r>
-        <w:t xml:space="preserve">quadrantes do radar, e processa os quadros de vídeo (</w:t>
-      </w:r>
-      <w:r>
-        <w:rPr>
-          <w:i/>
-          <w:iCs/>
-        </w:rPr>
-        <w:t xml:space="preserve">frames</w:t>
-      </w:r>
-      <w:r>
-        <w:t xml:space="preserve">) para</w:t>
-      </w:r>
-      <w:r>
-        <w:t xml:space="preserve"> </w:t>
-      </w:r>
-      <w:r>
-        <w:t xml:space="preserve">classificar o alvo por</w:t>
-      </w:r>
-      <w:r>
-        <w:t xml:space="preserve"> </w:t>
-      </w:r>
-      <w:r>
-        <w:t xml:space="preserve">sua cor, formato e tamanho</w:t>
-      </w:r>
-      <w:r>
-        <w:t xml:space="preserve">. Cada quadro capturado é entregue já decodificado à detecção, que executa</w:t>
-      </w:r>
-      <w:r>
-        <w:t xml:space="preserve"> </w:t>
-      </w:r>
-      <w:r>
-        <w:t xml:space="preserve">localmente um modelo YOLO26, na variante nano, em formato ONNX, para propor as regiões candidatas</w:t>
-      </w:r>
-      <w:r>
-        <w:t xml:space="preserve"> </w:t>
-      </w:r>
-      <w:r>
-        <w:t xml:space="preserve">da imagem. Cada</w:t>
-      </w:r>
-      <w:r>
-        <w:t xml:space="preserve"> </w:t>
-      </w:r>
-      <w:r>
-        <w:t xml:space="preserve">candidata é então comparada ao perfil do alvo previamente cadastrado – definido por cor, formato e</w:t>
-      </w:r>
-      <w:r>
-        <w:t xml:space="preserve"> </w:t>
-      </w:r>
-      <w:r>
-        <w:t xml:space="preserve">tamanho, e opcionalmente por fotos de referência recortadas no objeto de interesse. Havendo foto de</w:t>
-      </w:r>
-      <w:r>
-        <w:t xml:space="preserve"> </w:t>
-      </w:r>
-      <w:r>
-        <w:t xml:space="preserve">referência, a comparação combina um histograma de matiz e saturação com uma grade espacial de cor</w:t>
-      </w:r>
-      <w:r>
-        <w:t xml:space="preserve"> </w:t>
-      </w:r>
-      <w:r>
-        <w:t xml:space="preserve">média, usados como assinatura do objeto; na ausência de foto, o critério recai sobre a fração de</w:t>
-      </w:r>
-      <w:r>
-        <w:t xml:space="preserve"> </w:t>
-      </w:r>
-      <w:r>
-        <w:t xml:space="preserve">pixels com a cor cadastrada e sobre a classificação de formato. Quando o detector não propõe nenhuma</w:t>
-      </w:r>
-      <w:r>
-        <w:t xml:space="preserve"> </w:t>
-      </w:r>
-      <w:r>
-        <w:t xml:space="preserve">caixa com a cor do perfil, as regiões candidatas passam a ser propostas por segmentação de cor, como</w:t>
-      </w:r>
-      <w:r>
-        <w:t xml:space="preserve"> </w:t>
-      </w:r>
-      <w:r>
-        <w:t xml:space="preserve">último recurso na ordenação de candidatos.</w:t>
-      </w:r>
-    </w:p>
-    <w:p>
-      <w:pPr>
-        <w:pStyle w:val="BodyText"/>
-      </w:pPr>
-      <w:r>
-        <w:t xml:space="preserve">O envio das informações resultantes ao Arduino, para guiar o apontamento da torre (movimentos de pan</w:t>
-      </w:r>
-      <w:r>
-        <w:t xml:space="preserve"> </w:t>
-      </w:r>
-      <w:r>
-        <w:t xml:space="preserve">e tilt), foi projetado mas ainda não está implementado: o protocolo serial atual não possui comando</w:t>
-      </w:r>
-      <w:r>
-        <w:t xml:space="preserve"> </w:t>
-      </w:r>
-      <w:r>
-        <w:t xml:space="preserve">de apontamento, e a fusão entre a posição estimada pela visão e a distância medida pelos sensores</w:t>
-      </w:r>
-      <w:r>
-        <w:t xml:space="preserve"> </w:t>
-      </w:r>
-      <w:r>
-        <w:t xml:space="preserve">ultrassônicos permanece como etapa planejada. Como o hardware ainda não foi montado, a validação</w:t>
-      </w:r>
-      <w:r>
-        <w:t xml:space="preserve"> </w:t>
-      </w:r>
-      <w:r>
-        <w:t xml:space="preserve">funcional descrita neste trabalho foi feita por simulação, e nenhum resultado de campo é relatado.</w:t>
-      </w:r>
-    </w:p>
-    <w:p>
-      <w:pPr>
-        <w:pStyle w:val="Heading3"/>
-      </w:pPr>
-      <w:bookmarkStart w:id="27" w:name="_6fbb6364af1dc3569e882d01e930d8dd3360f73"/>
-      <w:r>
-        <w:t xml:space="preserve">Fluxo operacional</w:t>
-      </w:r>
-      <w:bookmarkEnd w:id="27"/>
-    </w:p>
-    <w:p>
-      <w:pPr>
-        <w:pStyle w:val="FirstParagraph"/>
-      </w:pPr>
-      <w:r>
-        <w:t xml:space="preserve">Em operação, o sistema segue estas etapas: (1) o Arduino varre o ambiente com os dois sensores</w:t>
-      </w:r>
-      <w:r>
-        <w:t xml:space="preserve"> </w:t>
-      </w:r>
-      <w:r>
-        <w:t xml:space="preserve">ultrassônicos e envia ângulo e distância à aplicação; (2) a aplicação converte cada leitura em</w:t>
-      </w:r>
-      <w:r>
-        <w:t xml:space="preserve"> </w:t>
-      </w:r>
-      <w:r>
-        <w:t xml:space="preserve">posição cartesiana, determina o quadrante, exibe o alvo no radar e registra a detecção; (3) em</w:t>
-      </w:r>
-      <w:r>
-        <w:t xml:space="preserve"> </w:t>
-      </w:r>
-      <w:r>
-        <w:t xml:space="preserve">paralelo, as câmeras fornecem quadros de vídeo, e o módulo de visão classifica o alvo por cor,</w:t>
-      </w:r>
-      <w:r>
-        <w:t xml:space="preserve"> </w:t>
-      </w:r>
-      <w:r>
-        <w:t xml:space="preserve">formato e tamanho; (4) a aplicação seleciona, entre as torres armadas disponíveis, a mais adequada</w:t>
-      </w:r>
-      <w:r>
-        <w:t xml:space="preserve"> </w:t>
-      </w:r>
-      <w:r>
-        <w:t xml:space="preserve">para o alvo, priorizando as do mesmo quadrante e, entre elas, a de menor distância euclidiana (por</w:t>
-      </w:r>
-      <w:r>
-        <w:t xml:space="preserve"> </w:t>
-      </w:r>
-      <w:r>
-        <w:t xml:space="preserve">proximidade, alvo a alvo); (5) o comando é enviado ao Arduino, que aciona a torre selecionada;</w:t>
-      </w:r>
-      <w:r>
-        <w:t xml:space="preserve"> </w:t>
-      </w:r>
-      <w:r>
-        <w:t xml:space="preserve">(6) o acionamento demonstrativo (laser de baixa potência ou LED) só ocorre respeitando a distância</w:t>
-      </w:r>
-      <w:r>
-        <w:t xml:space="preserve"> </w:t>
-      </w:r>
-      <w:r>
-        <w:t xml:space="preserve">mínima de segurança e as demais regras de segurança configuráveis do sistema; (7) toda ação</w:t>
-      </w:r>
-      <w:r>
-        <w:t xml:space="preserve"> </w:t>
-      </w:r>
-      <w:r>
-        <w:t xml:space="preserve">executada é registrada em auditoria.</w:t>
-      </w:r>
-    </w:p>
-    <w:p>
-      <w:pPr>
-        <w:pStyle w:val="BodyText"/>
-      </w:pPr>
-      <w:r>
-        <w:t xml:space="preserve">A seleção de torre e o acionamento dependem do modo de operação escolhido pelo operador, em um</w:t>
-      </w:r>
-      <w:r>
-        <w:t xml:space="preserve"> </w:t>
-      </w:r>
-      <w:r>
-        <w:t xml:space="preserve">modelo de três níveis: no primeiro, os alvos são apenas detectados e exibidos; no segundo,</w:t>
-      </w:r>
-      <w:r>
-        <w:t xml:space="preserve"> </w:t>
-      </w:r>
-      <w:r>
-        <w:t xml:space="preserve">acrescenta-se a seleção automática da torre, sem acionamento; no terceiro, acrescenta-se o</w:t>
-      </w:r>
-      <w:r>
-        <w:t xml:space="preserve"> </w:t>
-      </w:r>
-      <w:r>
-        <w:t xml:space="preserve">acionamento demonstrativo automático. Quando a regra de segurança reprova um acionamento, ele é</w:t>
-      </w:r>
-      <w:r>
-        <w:t xml:space="preserve"> </w:t>
-      </w:r>
-      <w:r>
-        <w:t xml:space="preserve">bloqueado e o motivo é registrado no console de eventos.</w:t>
-      </w:r>
-    </w:p>
-    <w:p>
-      <w:pPr>
-        <w:pStyle w:val="CaptionedFigure"/>
-      </w:pPr>
-      <w:r>
-        <w:drawing>
-          <wp:inline>
-            <wp:extent cx="911225" cy="4373880"/>
-            <wp:effectExtent b="0" l="0" r="0" t="0"/>
-            <wp:docPr descr="" title="" id="29" name="Picture"/>
-            <a:graphic>
-              <a:graphicData uri="http://schemas.openxmlformats.org/drawingml/2006/picture">
-                <pic:pic>
-                  <pic:nvPicPr>
-                    <pic:cNvPr descr="Fluxo_Operacional.png" id="30" name="Picture"/>
-                    <pic:cNvPicPr>
-                      <a:picLocks noChangeArrowheads="1" noChangeAspect="1"/>
-                    </pic:cNvPicPr>
-                  </pic:nvPicPr>
-                  <pic:blipFill>
-                    <a:blip r:embed="rId28"/>
+                    <a:blip r:embed="rId24"/>
                     <a:stretch>
                       <a:fillRect/>
                     </a:stretch>
@@ -3108,11 +3363,11 @@
       <w:pPr>
         <w:pStyle w:val="Heading3"/>
       </w:pPr>
-      <w:bookmarkStart w:id="31" w:name="_da5891337ffb17c529fe933ba8f5be170397a37"/>
+      <w:bookmarkStart w:id="27" w:name="_da5891337ffb17c529fe933ba8f5be170397a37"/>
       <w:r>
         <w:t xml:space="preserve">Controlador neuroevolutivo: heurística e rede neural combinadas</w:t>
       </w:r>
-      <w:bookmarkEnd w:id="31"/>
+      <w:bookmarkEnd w:id="27"/>
     </w:p>
     <w:p>
       <w:pPr>
@@ -3182,7 +3437,25 @@
         <w:t xml:space="preserve"> </w:t>
       </w:r>
       <w:r>
-        <w:t xml:space="preserve">aprendido por um algoritmo evolutivo próprio, sem biblioteca de aprendizado de máquina. Ambos</w:t>
+        <w:t xml:space="preserve">aprendido por um algoritmo evolutivo próprio, sem biblioteca de aprendizado de máquina.</w:t>
+      </w:r>
+      <w:r>
+        <w:t xml:space="preserve"> </w:t>
+      </w:r>
+      <w:r>
+        <w:t xml:space="preserve">Ajustar caso a biblioteca de neuroevolução funcione (biblioteca em teste: [NOME DA</w:t>
+      </w:r>
+      <w:r>
+        <w:t xml:space="preserve"> </w:t>
+      </w:r>
+      <w:r>
+        <w:t xml:space="preserve">BIBLIOTECA – confirmar]).</w:t>
+      </w:r>
+      <w:r>
+        <w:t xml:space="preserve"> </w:t>
+      </w:r>
+      <w:r>
+        <w:t xml:space="preserve">Ambos</w:t>
       </w:r>
       <w:r>
         <w:t xml:space="preserve"> </w:t>
@@ -3244,7 +3517,7 @@
         <w:t xml:space="preserve"> </w:t>
       </w:r>
       <w:r>
-        <w:t xml:space="preserve">também impõe cinco regras de segurança e refinamento, cada uma ativável individualmente no painel de</w:t>
+        <w:t xml:space="preserve">também impõe quatro regras de segurança e refinamento, cada uma ativável individualmente no painel de</w:t>
       </w:r>
       <w:r>
         <w:t xml:space="preserve"> </w:t>
@@ -3262,13 +3535,7 @@
         <w:t xml:space="preserve"> </w:t>
       </w:r>
       <w:r>
-        <w:t xml:space="preserve">a torre de um alvo mais distante; corredor de tiro, que descarta candidatas cuja linha de disparo</w:t>
-      </w:r>
-      <w:r>
-        <w:t xml:space="preserve"> </w:t>
-      </w:r>
-      <w:r>
-        <w:t xml:space="preserve">atravesse uma zona morta ativa; balanceamento de carga, que prefere, entre torres empatadas, a</w:t>
+        <w:t xml:space="preserve">a torre de um alvo mais distante; balanceamento de carga, que prefere, entre torres empatadas, a</w:t>
       </w:r>
       <w:r>
         <w:t xml:space="preserve"> </w:t>
@@ -3286,19 +3553,13 @@
         <w:t xml:space="preserve"> </w:t>
       </w:r>
       <w:r>
-        <w:t xml:space="preserve">heurística impõe dois limites absolutos ao disparo, nunca delegados à rede: um tempo mínimo de mira</w:t>
-      </w:r>
-      <w:r>
-        <w:t xml:space="preserve"> </w:t>
-      </w:r>
-      <w:r>
-        <w:t xml:space="preserve">de 0,3 s e um limiar mínimo de certeza de identificação do alvo</w:t>
-      </w:r>
-      <w:r>
-        <w:t xml:space="preserve"> </w:t>
-      </w:r>
-      <w:r>
-        <w:t xml:space="preserve">(</w:t>
+        <w:t xml:space="preserve">heurística impõe um limite absoluto ao disparo, nunca delegado à rede: um limiar mínimo de certeza</w:t>
+      </w:r>
+      <w:r>
+        <w:t xml:space="preserve"> </w:t>
+      </w:r>
+      <w:r>
+        <w:t xml:space="preserve">de identificação do alvo (</w:t>
       </w:r>
       <w:r>
         <w:rPr>
@@ -3307,13 +3568,13 @@
         <w:t xml:space="preserve">LimiarConfiancaDisparoPercentual</w:t>
       </w:r>
       <w:r>
-        <w:t xml:space="preserve">), abaixo do qual o disparo é recusado independentemente</w:t>
-      </w:r>
-      <w:r>
-        <w:t xml:space="preserve"> </w:t>
-      </w:r>
-      <w:r>
-        <w:t xml:space="preserve">de qualquer outra avaliação.</w:t>
+        <w:t xml:space="preserve">), abaixo do qual o disparo é</w:t>
+      </w:r>
+      <w:r>
+        <w:t xml:space="preserve"> </w:t>
+      </w:r>
+      <w:r>
+        <w:t xml:space="preserve">recusado independentemente de qualquer outra avaliação.</w:t>
       </w:r>
     </w:p>
     <w:p>
@@ -3321,6 +3582,71 @@
         <w:pStyle w:val="BodyText"/>
       </w:pPr>
       <w:r>
+        <w:t xml:space="preserve">Proposta de mudança na lógica de seleção de torre (registrada, ainda não implementada):</w:t>
+      </w:r>
+      <w:r>
+        <w:t xml:space="preserve"> </w:t>
+      </w:r>
+      <w:r>
+        <w:t xml:space="preserve">hoje o sistema escolhe UMA torre por alvo e só dispara quando a confiança de identificação atinge o</w:t>
+      </w:r>
+      <w:r>
+        <w:t xml:space="preserve"> </w:t>
+      </w:r>
+      <w:r>
+        <w:t xml:space="preserve">limiar configurado. A mudança proposta é que, ao identificar um alvo, todas as câmeras e torres</w:t>
+      </w:r>
+      <w:r>
+        <w:t xml:space="preserve"> </w:t>
+      </w:r>
+      <w:r>
+        <w:t xml:space="preserve">voltem a atenção para ele simultaneamente, em vez de uma escolha exclusiva – o objetivo é</w:t>
+      </w:r>
+      <w:r>
+        <w:t xml:space="preserve"> </w:t>
+      </w:r>
+      <w:r>
+        <w:t xml:space="preserve">reconhecer o alvo mais rápido (mais câmeras observando ao mesmo tempo) e acelerar o abate. Essa</w:t>
+      </w:r>
+      <w:r>
+        <w:t xml:space="preserve"> </w:t>
+      </w:r>
+      <w:r>
+        <w:t xml:space="preserve">mudança ainda não foi implementada no software; o detalhamento da proposta e o impacto esperado em</w:t>
+      </w:r>
+      <w:r>
+        <w:t xml:space="preserve"> </w:t>
+      </w:r>
+      <w:r>
+        <w:rPr>
+          <w:rStyle w:val="VerbatimChar"/>
+        </w:rPr>
+        <w:t xml:space="preserve">TowerSelectionService</w:t>
+      </w:r>
+      <w:r>
+        <w:t xml:space="preserve"> </w:t>
+      </w:r>
+      <w:r>
+        <w:t xml:space="preserve">e no treinamento da rede estão registrados em</w:t>
+      </w:r>
+      <w:r>
+        <w:t xml:space="preserve"> </w:t>
+      </w:r>
+      <w:r>
+        <w:rPr>
+          <w:rStyle w:val="VerbatimChar"/>
+        </w:rPr>
+        <w:t xml:space="preserve">Melhoria_de_artigo.md</w:t>
+      </w:r>
+      <w:r>
+        <w:t xml:space="preserve">.</w:t>
+      </w:r>
+    </w:p>
+    <w:p>
+      <w:pPr>
+        <w:pStyle w:val="BodyText"/>
+      </w:pPr>
+      <w:r>
         <w:t xml:space="preserve">A rede neural, por sua vez, não decide essas regras de segurança nem a cascata de camadas – ela</w:t>
       </w:r>
       <w:r>
@@ -3359,7 +3685,13 @@
         <w:t xml:space="preserve"> </w:t>
       </w:r>
       <w:r>
-        <w:t xml:space="preserve">totalmente conectada, implementada do zero (sem biblioteca de aprendizado de</w:t>
+        <w:t xml:space="preserve">(sinal que só percorre a rede em um sentido, da entrada à saída, sem laços de</w:t>
+      </w:r>
+      <w:r>
+        <w:t xml:space="preserve"> </w:t>
+      </w:r>
+      <w:r>
+        <w:t xml:space="preserve">realimentação) totalmente conectada, implementada do zero (sem biblioteca de aprendizado de</w:t>
       </w:r>
       <w:r>
         <w:t xml:space="preserve"> </w:t>
@@ -3371,7 +3703,51 @@
         <w:t xml:space="preserve"> </w:t>
       </w:r>
       <w:r>
-        <w:t xml:space="preserve">tanh em todas as camadas. As sete entradas – todas normalizadas no intervalo</w:t>
+        <w:t xml:space="preserve">tanh (função que comprime a soma ponderada de cada neurônio no intervalo</w:t>
+      </w:r>
+      <w:r>
+        <w:t xml:space="preserve"> </w:t>
+      </w:r>
+      <m:oMath>
+        <m:r>
+          <m:rPr>
+            <m:sty m:val="p"/>
+          </m:rPr>
+          <m:t>[</m:t>
+        </m:r>
+        <m:r>
+          <m:rPr>
+            <m:sty m:val="p"/>
+          </m:rPr>
+          <m:t>−</m:t>
+        </m:r>
+        <m:r>
+          <m:t>1</m:t>
+        </m:r>
+        <m:r>
+          <m:rPr>
+            <m:sty m:val="p"/>
+          </m:rPr>
+          <m:t>,</m:t>
+        </m:r>
+        <m:r>
+          <m:t>1</m:t>
+        </m:r>
+        <m:r>
+          <m:rPr>
+            <m:sty m:val="p"/>
+          </m:rPr>
+          <m:t>]</m:t>
+        </m:r>
+      </m:oMath>
+      <w:r>
+        <w:t xml:space="preserve">) em todas as</w:t>
+      </w:r>
+      <w:r>
+        <w:t xml:space="preserve"> </w:t>
+      </w:r>
+      <w:r>
+        <w:t xml:space="preserve">camadas. As sete entradas – todas normalizadas no intervalo</w:t>
       </w:r>
       <w:r>
         <w:t xml:space="preserve"> </w:t>
@@ -3482,19 +3858,49 @@
         <w:t xml:space="preserve"> </w:t>
       </w:r>
       <w:r>
-        <w:t xml:space="preserve">uniforme, mutação gaussiana e elitismo, e o genoma final é</w:t>
-      </w:r>
-      <w:r>
-        <w:t xml:space="preserve"> </w:t>
-      </w:r>
-      <w:r>
-        <w:t xml:space="preserve">embutido na aplicação como um vetor de pesos fixo, sem qualquer etapa de treinamento em tempo de</w:t>
-      </w:r>
-      <w:r>
-        <w:t xml:space="preserve"> </w:t>
-      </w:r>
-      <w:r>
-        <w:t xml:space="preserve">execução.</w:t>
+        <w:t xml:space="preserve">uniforme, mutação gaussiana (perturbação de cada peso por um valor</w:t>
+      </w:r>
+      <w:r>
+        <w:t xml:space="preserve"> </w:t>
+      </w:r>
+      <w:r>
+        <w:t xml:space="preserve">aleatório de distribuição normal, preferida a outras formas de mutação por manter a maioria das</w:t>
+      </w:r>
+      <w:r>
+        <w:t xml:space="preserve"> </w:t>
+      </w:r>
+      <w:r>
+        <w:t xml:space="preserve">alterações pequenas e permitir ajuste fino sem descartar o que o genoma já aprendeu – detalhamento</w:t>
+      </w:r>
+      <w:r>
+        <w:t xml:space="preserve"> </w:t>
+      </w:r>
+      <w:r>
+        <w:t xml:space="preserve">comparativo com outros tipos de mutação em</w:t>
+      </w:r>
+      <w:r>
+        <w:t xml:space="preserve"> </w:t>
+      </w:r>
+      <w:r>
+        <w:rPr>
+          <w:rStyle w:val="VerbatimChar"/>
+        </w:rPr>
+        <w:t xml:space="preserve">ApoioDeApresentacao.md</w:t>
+      </w:r>
+      <w:r>
+        <w:t xml:space="preserve">) e elitismo, e o genoma</w:t>
+      </w:r>
+      <w:r>
+        <w:t xml:space="preserve"> </w:t>
+      </w:r>
+      <w:r>
+        <w:t xml:space="preserve">final é embutido na aplicação como um vetor de pesos fixo, sem qualquer etapa de treinamento em</w:t>
+      </w:r>
+      <w:r>
+        <w:t xml:space="preserve"> </w:t>
+      </w:r>
+      <w:r>
+        <w:t xml:space="preserve">tempo de execução.</w:t>
       </w:r>
     </w:p>
     <w:p>
@@ -3548,13 +3954,13 @@
         <w:t xml:space="preserve"> </w:t>
       </w:r>
       <w:r>
-        <w:t xml:space="preserve">qualquer autorização da rede que viole o tempo mínimo de mira, a certeza mínima ou uma zona morta</w:t>
-      </w:r>
-      <w:r>
-        <w:t xml:space="preserve"> </w:t>
-      </w:r>
-      <w:r>
-        <w:t xml:space="preserve">ativa. Essa hierarquia tem uma consequência deliberada para o pior caso: uma generalização</w:t>
+        <w:t xml:space="preserve">qualquer autorização da rede que viole a certeza mínima de identificação do alvo. Essa hierarquia</w:t>
+      </w:r>
+      <w:r>
+        <w:t xml:space="preserve"> </w:t>
+      </w:r>
+      <w:r>
+        <w:t xml:space="preserve">tem uma consequência deliberada para o pior caso: uma generalização</w:t>
       </w:r>
       <w:r>
         <w:t xml:space="preserve"> </w:t>
@@ -3607,7 +4013,19 @@
         <w:t xml:space="preserve"> </w:t>
       </w:r>
       <w:r>
-        <w:t xml:space="preserve">heurística e rede juntas – em episódios simulados de 45 s, com as torres reais do projeto, alvos</w:t>
+        <w:t xml:space="preserve">heurística e rede juntas – em episódios simulados (45 s por padrão, mas sem limite de duração no</w:t>
+      </w:r>
+      <w:r>
+        <w:t xml:space="preserve"> </w:t>
+      </w:r>
+      <w:r>
+        <w:t xml:space="preserve">treino que gerou o genoma de produção atual embutido no executável – essa duração só corta o</w:t>
+      </w:r>
+      <w:r>
+        <w:t xml:space="preserve"> </w:t>
+      </w:r>
+      <w:r>
+        <w:t xml:space="preserve">episódio por tempo; invasão de torre ainda o encerra antes), com as torres reais do projeto, alvos</w:t>
       </w:r>
       <w:r>
         <w:t xml:space="preserve"> </w:t>
@@ -3653,13 +4071,13 @@
         <w:t xml:space="preserve"> </w:t>
       </w:r>
       <w:r>
-        <w:t xml:space="preserve">– não há genoma "vencedor" que dispare fora da zona morta ou abaixo da certeza mínima, porque essas</w:t>
-      </w:r>
-      <w:r>
-        <w:t xml:space="preserve"> </w:t>
-      </w:r>
-      <w:r>
-        <w:t xml:space="preserve">decisões nunca chegam a ser avaliadas como tal pelo ambiente de treino. Essa mesma dependência, no</w:t>
+        <w:t xml:space="preserve">– não há genoma "vencedor" que dispare abaixo da certeza mínima, porque essa decisão nunca chega a</w:t>
+      </w:r>
+      <w:r>
+        <w:t xml:space="preserve"> </w:t>
+      </w:r>
+      <w:r>
+        <w:t xml:space="preserve">ser avaliada como tal pelo ambiente de treino. Essa mesma dependência, no</w:t>
       </w:r>
       <w:r>
         <w:t xml:space="preserve"> </w:t>
@@ -3759,102 +4177,159 @@
       </w:r>
       <w:r>
         <w:t xml:space="preserve">genética.</w:t>
+      </w:r>
+    </w:p>
+    <w:tbl>
+      <w:tblPr>
+        <w:tblStyle w:val="FigureTable"/>
+        <w:tblW w:type="auto" w:w="0"/>
+        <w:jc w:val="center"/>
+        <w:tblLook w:firstRow="0" w:lastRow="0" w:firstColumn="0" w:lastColumn="0"/>
+      </w:tblPr>
+      <w:tblGrid/>
+    </w:tbl>
+    <w:p>
+      <w:pPr>
+        <w:pStyle w:val="ImageCaption"/>
+      </w:pPr>
+      <w:r>
+        <w:t xml:space="preserve">Fluxo de decisão do controlador híbrido: a heurística determinística filtra e, ao final,</w:t>
+      </w:r>
+      <w:r>
+        <w:t xml:space="preserve"> </w:t>
+      </w:r>
+      <w:r>
+        <w:t xml:space="preserve">veta; a rede neural decide apenas dentro do espaço já validado (dos autores).</w:t>
       </w:r>
     </w:p>
     <w:p>
       <w:pPr>
-        <w:pStyle w:val="Figure"/>
-      </w:pPr>
-      <w:r>
-        <w:drawing>
-          <wp:inline>
-            <wp:extent cx="4452730" cy="1229393"/>
-            <wp:effectExtent b="0" l="0" r="0" t="0"/>
-            <wp:docPr descr="" title="" id="33" name="Picture"/>
-            <a:graphic>
-              <a:graphicData uri="http://schemas.openxmlformats.org/drawingml/2006/picture">
-                <pic:pic>
-                  <pic:nvPicPr>
-                    <pic:cNvPr descr="fluxo_decisao_controlador.png" id="34" name="Picture"/>
-                    <pic:cNvPicPr>
-                      <a:picLocks noChangeArrowheads="1" noChangeAspect="1"/>
-                    </pic:cNvPicPr>
-                  </pic:nvPicPr>
-                  <pic:blipFill>
-                    <a:blip r:embed="rId32"/>
-                    <a:stretch>
-                      <a:fillRect/>
-                    </a:stretch>
-                  </pic:blipFill>
-                  <pic:spPr bwMode="auto">
-                    <a:xfrm>
-                      <a:off x="0" y="0"/>
-                      <a:ext cx="4452730" cy="1229393"/>
-                    </a:xfrm>
-                    <a:prstGeom prst="rect">
-                      <a:avLst/>
-                    </a:prstGeom>
-                    <a:noFill/>
-                    <a:ln w="9525">
-                      <a:noFill/>
-                      <a:headEnd/>
-                      <a:tailEnd/>
-                    </a:ln>
-                  </pic:spPr>
-                </pic:pic>
-              </a:graphicData>
-            </a:graphic>
-          </wp:inline>
-        </w:drawing>
-      </w:r>
+        <w:pStyle w:val="Heading3"/>
+      </w:pPr>
+      <w:bookmarkStart w:id="28" w:name="_119a6bdc6d18c559c5be26f210764d7f901446e"/>
+      <w:r>
+        <w:t xml:space="preserve">Análise experimental de hiperparâmetros: população e neurônios ocultos</w:t>
+      </w:r>
+      <w:bookmarkEnd w:id="28"/>
     </w:p>
     <w:p>
       <w:pPr>
-        <w:pStyle w:val="Heading3"/>
-      </w:pPr>
-      <w:bookmarkStart w:id="35" w:name="_119a6bdc6d18c559c5be26f210764d7f901446e"/>
-      <w:r>
-        <w:t xml:space="preserve">Análise experimental de hiperparâmetros: população e neurônios ocultos</w:t>
-      </w:r>
-      <w:bookmarkEnd w:id="35"/>
-    </w:p>
-    <w:p>
-      <w:pPr>
         <w:pStyle w:val="FirstParagraph"/>
       </w:pPr>
       <w:r>
-        <w:t xml:space="preserve">Para justificar tecnicamente a escolha dos hiperparâmetros do algoritmo genético com dados reais de</w:t>
-      </w:r>
-      <w:r>
-        <w:t xml:space="preserve"> </w:t>
-      </w:r>
-      <w:r>
-        <w:t xml:space="preserve">treinamento, em vez de apenas por convenção, foi conduzido um experimento controlado com as seis</w:t>
-      </w:r>
-      <w:r>
-        <w:t xml:space="preserve"> </w:t>
-      </w:r>
-      <w:r>
-        <w:t xml:space="preserve">combinações do produto cartesiano entre três tamanhos de população (30, 60 e 120 indivíduos) e duas</w:t>
-      </w:r>
-      <w:r>
-        <w:t xml:space="preserve"> </w:t>
-      </w:r>
-      <w:r>
-        <w:t xml:space="preserve">arquiteturas de rede (4 e 16 neurônios na camada oculta, mantendo fixas as 7 entradas e as 2 saídas</w:t>
-      </w:r>
-      <w:r>
-        <w:t xml:space="preserve"> </w:t>
-      </w:r>
-      <w:r>
-        <w:t xml:space="preserve">descritas na Seção </w:t>
+        <w:rPr>
+          <w:i/>
+          <w:iCs/>
+        </w:rPr>
+        <w:t xml:space="preserve">Fitness</w:t>
+      </w:r>
+      <w:r>
+        <w:t xml:space="preserve">, termo-padrão da literatura de algoritmos genéticos (de onde o RadarTorres o</w:t>
+      </w:r>
+      <w:r>
+        <w:t xml:space="preserve"> </w:t>
+      </w:r>
+      <w:r>
+        <w:t xml:space="preserve">herda), é a nota numérica que mede o quão bem um genoma específico (um vetor de pesos da rede) se</w:t>
+      </w:r>
+      <w:r>
+        <w:t xml:space="preserve"> </w:t>
+      </w:r>
+      <w:r>
+        <w:t xml:space="preserve">comportou em um episódio simulado – descrita em detalhe na Seção </w:t>
       </w:r>
       <w:hyperlink w:anchor="_da5891337ffb17c529fe933ba8f5be170397a37">
         <w:r>
           <w:rPr>
             <w:rStyle w:val="Hyperlink"/>
           </w:rPr>
-          <w:t xml:space="preserve">2.3.5</w:t>
+          <w:t xml:space="preserve">2.3.4</w:t>
+        </w:r>
+      </w:hyperlink>
+      <w:r>
+        <w:t xml:space="preserve"> </w:t>
+      </w:r>
+      <w:r>
+        <w:t xml:space="preserve">(soma de recompensas por abate e penalidades por fuga, invasão de torre e recusa de disparo). Um</w:t>
+      </w:r>
+      <w:r>
+        <w:t xml:space="preserve"> </w:t>
+      </w:r>
+      <w:r>
+        <w:t xml:space="preserve">fitness que continua subindo entre gerações indica que a seleção, o</w:t>
+      </w:r>
+      <w:r>
+        <w:t xml:space="preserve"> </w:t>
+      </w:r>
+      <w:r>
+        <w:rPr>
+          <w:i/>
+          <w:iCs/>
+        </w:rPr>
+        <w:t xml:space="preserve">crossover</w:t>
+      </w:r>
+      <w:r>
+        <w:t xml:space="preserve"> </w:t>
+      </w:r>
+      <w:r>
+        <w:t xml:space="preserve">e a mutação</w:t>
+      </w:r>
+      <w:r>
+        <w:t xml:space="preserve"> </w:t>
+      </w:r>
+      <w:r>
+        <w:t xml:space="preserve">estão de fato encontrando genomas melhores que os da geração anterior; um fitness estagnado indica</w:t>
+      </w:r>
+      <w:r>
+        <w:t xml:space="preserve"> </w:t>
+      </w:r>
+      <w:r>
+        <w:t xml:space="preserve">que a busca chegou a um patamar (ótimo local ou teto do que a arquitetura permite) e não está mais</w:t>
+      </w:r>
+      <w:r>
+        <w:t xml:space="preserve"> </w:t>
+      </w:r>
+      <w:r>
+        <w:t xml:space="preserve">progredindo com as gerações restantes.</w:t>
+      </w:r>
+    </w:p>
+    <w:p>
+      <w:pPr>
+        <w:pStyle w:val="BodyText"/>
+      </w:pPr>
+      <w:r>
+        <w:t xml:space="preserve">Para justificar tecnicamente a escolha dos hiperparâmetros do algoritmo genético com dados reais de</w:t>
+      </w:r>
+      <w:r>
+        <w:t xml:space="preserve"> </w:t>
+      </w:r>
+      <w:r>
+        <w:t xml:space="preserve">treinamento, em vez de apenas por convenção, foi conduzido um experimento controlado com as seis</w:t>
+      </w:r>
+      <w:r>
+        <w:t xml:space="preserve"> </w:t>
+      </w:r>
+      <w:r>
+        <w:t xml:space="preserve">combinações do produto cartesiano entre três tamanhos de população (30, 60 e 120 indivíduos) e duas</w:t>
+      </w:r>
+      <w:r>
+        <w:t xml:space="preserve"> </w:t>
+      </w:r>
+      <w:r>
+        <w:t xml:space="preserve">arquiteturas de rede (4 e 16 neurônios na camada oculta, mantendo fixas as 7 entradas e as 2 saídas</w:t>
+      </w:r>
+      <w:r>
+        <w:t xml:space="preserve"> </w:t>
+      </w:r>
+      <w:r>
+        <w:t xml:space="preserve">descritas na Seção </w:t>
+      </w:r>
+      <w:hyperlink w:anchor="_da5891337ffb17c529fe933ba8f5be170397a37">
+        <w:r>
+          <w:rPr>
+            <w:rStyle w:val="Hyperlink"/>
+          </w:rPr>
+          <w:t xml:space="preserve">2.3.4</w:t>
         </w:r>
       </w:hyperlink>
       <w:r>
@@ -3974,7 +4449,7 @@
         <w:t xml:space="preserve">consultável na própria tela de Treinamento do Controlador.</w:t>
       </w:r>
     </w:p>
-    <w:bookmarkStart w:id="36" w:name="_7e60257ab62ab0e0b551aceabf79f7a4db1451b"/>
+    <w:bookmarkStart w:id="29" w:name="_7e60257ab62ab0e0b551aceabf79f7a4db1451b"/>
     <w:p>
       <w:pPr>
         <w:pStyle w:val="TableCaption"/>
@@ -4011,7 +4486,7 @@
           <w:p>
             <w:pPr>
               <w:pStyle w:val="Compact"/>
-              <w:jc w:val="left"/>
+              <w:jc w:val="center"/>
             </w:pPr>
             <w:r>
               <w:rPr>
@@ -4027,7 +4502,7 @@
           <w:p>
             <w:pPr>
               <w:pStyle w:val="Compact"/>
-              <w:jc w:val="left"/>
+              <w:jc w:val="center"/>
             </w:pPr>
             <w:r>
               <w:rPr>
@@ -4043,7 +4518,7 @@
           <w:p>
             <w:pPr>
               <w:pStyle w:val="Compact"/>
-              <w:jc w:val="left"/>
+              <w:jc w:val="center"/>
             </w:pPr>
             <w:r>
               <w:rPr>
@@ -4059,7 +4534,7 @@
           <w:p>
             <w:pPr>
               <w:pStyle w:val="Compact"/>
-              <w:jc w:val="left"/>
+              <w:jc w:val="center"/>
             </w:pPr>
             <w:r>
               <w:rPr>
@@ -4077,7 +4552,7 @@
           <w:p>
             <w:pPr>
               <w:pStyle w:val="Compact"/>
-              <w:jc w:val="left"/>
+              <w:jc w:val="center"/>
             </w:pPr>
             <w:r>
               <w:t xml:space="preserve">30</w:t>
@@ -4089,7 +4564,7 @@
           <w:p>
             <w:pPr>
               <w:pStyle w:val="Compact"/>
-              <w:jc w:val="left"/>
+              <w:jc w:val="center"/>
             </w:pPr>
             <w:r>
               <w:t xml:space="preserve">4</w:t>
@@ -4101,7 +4576,7 @@
           <w:p>
             <w:pPr>
               <w:pStyle w:val="Compact"/>
-              <w:jc w:val="left"/>
+              <w:jc w:val="center"/>
             </w:pPr>
             <w:r>
               <w:t xml:space="preserve">300</w:t>
@@ -4113,7 +4588,7 @@
           <w:p>
             <w:pPr>
               <w:pStyle w:val="Compact"/>
-              <w:jc w:val="left"/>
+              <w:jc w:val="center"/>
             </w:pPr>
             <w:r>
               <w:t xml:space="preserve">49,81</w:t>
@@ -4127,7 +4602,7 @@
           <w:p>
             <w:pPr>
               <w:pStyle w:val="Compact"/>
-              <w:jc w:val="left"/>
+              <w:jc w:val="center"/>
             </w:pPr>
             <w:r>
               <w:t xml:space="preserve">60</w:t>
@@ -4139,7 +4614,7 @@
           <w:p>
             <w:pPr>
               <w:pStyle w:val="Compact"/>
-              <w:jc w:val="left"/>
+              <w:jc w:val="center"/>
             </w:pPr>
             <w:r>
               <w:t xml:space="preserve">4</w:t>
@@ -4151,7 +4626,7 @@
           <w:p>
             <w:pPr>
               <w:pStyle w:val="Compact"/>
-              <w:jc w:val="left"/>
+              <w:jc w:val="center"/>
             </w:pPr>
             <w:r>
               <w:t xml:space="preserve">300</w:t>
@@ -4163,7 +4638,7 @@
           <w:p>
             <w:pPr>
               <w:pStyle w:val="Compact"/>
-              <w:jc w:val="left"/>
+              <w:jc w:val="center"/>
             </w:pPr>
             <w:r>
               <w:rPr>
@@ -4181,7 +4656,7 @@
           <w:p>
             <w:pPr>
               <w:pStyle w:val="Compact"/>
-              <w:jc w:val="left"/>
+              <w:jc w:val="center"/>
             </w:pPr>
             <w:r>
               <w:t xml:space="preserve">120</w:t>
@@ -4193,7 +4668,7 @@
           <w:p>
             <w:pPr>
               <w:pStyle w:val="Compact"/>
-              <w:jc w:val="left"/>
+              <w:jc w:val="center"/>
             </w:pPr>
             <w:r>
               <w:t xml:space="preserve">4</w:t>
@@ -4205,7 +4680,7 @@
           <w:p>
             <w:pPr>
               <w:pStyle w:val="Compact"/>
-              <w:jc w:val="left"/>
+              <w:jc w:val="center"/>
             </w:pPr>
             <w:r>
               <w:t xml:space="preserve">300</w:t>
@@ -4217,7 +4692,7 @@
           <w:p>
             <w:pPr>
               <w:pStyle w:val="Compact"/>
-              <w:jc w:val="left"/>
+              <w:jc w:val="center"/>
             </w:pPr>
             <w:r>
               <w:t xml:space="preserve">49,81</w:t>
@@ -4231,7 +4706,7 @@
           <w:p>
             <w:pPr>
               <w:pStyle w:val="Compact"/>
-              <w:jc w:val="left"/>
+              <w:jc w:val="center"/>
             </w:pPr>
             <w:r>
               <w:t xml:space="preserve">30</w:t>
@@ -4243,7 +4718,7 @@
           <w:p>
             <w:pPr>
               <w:pStyle w:val="Compact"/>
-              <w:jc w:val="left"/>
+              <w:jc w:val="center"/>
             </w:pPr>
             <w:r>
               <w:t xml:space="preserve">16</w:t>
@@ -4255,7 +4730,7 @@
           <w:p>
             <w:pPr>
               <w:pStyle w:val="Compact"/>
-              <w:jc w:val="left"/>
+              <w:jc w:val="center"/>
             </w:pPr>
             <w:r>
               <w:t xml:space="preserve">300</w:t>
@@ -4267,7 +4742,7 @@
           <w:p>
             <w:pPr>
               <w:pStyle w:val="Compact"/>
-              <w:jc w:val="left"/>
+              <w:jc w:val="center"/>
             </w:pPr>
             <w:r>
               <w:t xml:space="preserve">49,81</w:t>
@@ -4281,7 +4756,7 @@
           <w:p>
             <w:pPr>
               <w:pStyle w:val="Compact"/>
-              <w:jc w:val="left"/>
+              <w:jc w:val="center"/>
             </w:pPr>
             <w:r>
               <w:t xml:space="preserve">60</w:t>
@@ -4293,7 +4768,7 @@
           <w:p>
             <w:pPr>
               <w:pStyle w:val="Compact"/>
-              <w:jc w:val="left"/>
+              <w:jc w:val="center"/>
             </w:pPr>
             <w:r>
               <w:t xml:space="preserve">16</w:t>
@@ -4305,7 +4780,7 @@
           <w:p>
             <w:pPr>
               <w:pStyle w:val="Compact"/>
-              <w:jc w:val="left"/>
+              <w:jc w:val="center"/>
             </w:pPr>
             <w:r>
               <w:t xml:space="preserve">300</w:t>
@@ -4317,7 +4792,7 @@
           <w:p>
             <w:pPr>
               <w:pStyle w:val="Compact"/>
-              <w:jc w:val="left"/>
+              <w:jc w:val="center"/>
             </w:pPr>
             <w:r>
               <w:t xml:space="preserve">49,81</w:t>
@@ -4331,7 +4806,7 @@
           <w:p>
             <w:pPr>
               <w:pStyle w:val="Compact"/>
-              <w:jc w:val="left"/>
+              <w:jc w:val="center"/>
             </w:pPr>
             <w:r>
               <w:t xml:space="preserve">120</w:t>
@@ -4343,7 +4818,7 @@
           <w:p>
             <w:pPr>
               <w:pStyle w:val="Compact"/>
-              <w:jc w:val="left"/>
+              <w:jc w:val="center"/>
             </w:pPr>
             <w:r>
               <w:t xml:space="preserve">16</w:t>
@@ -4355,7 +4830,7 @@
           <w:p>
             <w:pPr>
               <w:pStyle w:val="Compact"/>
-              <w:jc w:val="left"/>
+              <w:jc w:val="center"/>
             </w:pPr>
             <w:r>
               <w:t xml:space="preserve">300</w:t>
@@ -4367,7 +4842,7 @@
           <w:p>
             <w:pPr>
               <w:pStyle w:val="Compact"/>
-              <w:jc w:val="left"/>
+              <w:jc w:val="center"/>
             </w:pPr>
             <w:r>
               <w:t xml:space="preserve">49,81</w:t>
@@ -4376,7 +4851,7 @@
         </w:tc>
       </w:tr>
     </w:tbl>
-    <w:bookmarkEnd w:id="36"/>
+    <w:bookmarkEnd w:id="29"/>
     <w:p>
       <w:pPr>
         <w:pStyle w:val="FirstParagraph"/>
@@ -4494,7 +4969,35 @@
         <w:t xml:space="preserve"> </w:t>
       </w:r>
       <w:r>
-        <w:t xml:space="preserve">configuração, não apenas por convergência das seis populações. As seeds usadas para gerar os</w:t>
+        <w:t xml:space="preserve">configuração, não apenas por convergência das seis populações. As</w:t>
+      </w:r>
+      <w:r>
+        <w:t xml:space="preserve"> </w:t>
+      </w:r>
+      <w:r>
+        <w:rPr>
+          <w:i/>
+          <w:iCs/>
+        </w:rPr>
+        <w:t xml:space="preserve">seeds</w:t>
+      </w:r>
+      <w:r>
+        <w:t xml:space="preserve"> </w:t>
+      </w:r>
+      <w:r>
+        <w:t xml:space="preserve">(o número inteiro</w:t>
+      </w:r>
+      <w:r>
+        <w:t xml:space="preserve"> </w:t>
+      </w:r>
+      <w:r>
+        <w:t xml:space="preserve">que inicializa o gerador de números pseudoaleatórios do episódio – a mesma seed sempre produz</w:t>
+      </w:r>
+      <w:r>
+        <w:t xml:space="preserve"> </w:t>
+      </w:r>
+      <w:r>
+        <w:t xml:space="preserve">exatamente os mesmos alvos, nas mesmas posições e velocidades, byte a byte) usadas para gerar os</w:t>
       </w:r>
       <w:r>
         <w:t xml:space="preserve"> </w:t>
@@ -4566,7 +5069,25 @@
         <w:t xml:space="preserve"> </w:t>
       </w:r>
       <w:r>
-        <w:t xml:space="preserve">se repete em cinco das seis combinações. As duas explicações não são mutuamente exclusivas: é</w:t>
+        <w:t xml:space="preserve">se repete em cinco das seis combinações. Em resumo: o desenho do experimento, por si só, já é capaz</w:t>
+      </w:r>
+      <w:r>
+        <w:t xml:space="preserve"> </w:t>
+      </w:r>
+      <w:r>
+        <w:t xml:space="preserve">de produzir esse número repetido, então o resultado não prova, isolado, que as seis combinações</w:t>
+      </w:r>
+      <w:r>
+        <w:t xml:space="preserve"> </w:t>
+      </w:r>
+      <w:r>
+        <w:t xml:space="preserve">convergiram para a mesma estratégia – só que elas poderiam ter convergido, e o desenho não distingue</w:t>
+      </w:r>
+      <w:r>
+        <w:t xml:space="preserve"> </w:t>
+      </w:r>
+      <w:r>
+        <w:t xml:space="preserve">as duas situações. As duas explicações não são mutuamente exclusivas: é</w:t>
       </w:r>
       <w:r>
         <w:t xml:space="preserve"> </w:t>
@@ -4685,6 +5206,312 @@
         <w:pStyle w:val="BodyText"/>
       </w:pPr>
       <w:r>
+        <w:t xml:space="preserve">Ambas as ressalvas acima são instâncias de um problema metodológico já bem documentado na</w:t>
+      </w:r>
+      <w:r>
+        <w:t xml:space="preserve"> </w:t>
+      </w:r>
+      <w:r>
+        <w:t xml:space="preserve">literatura de avaliação de agentes treinados por métodos estocásticos.</w:t>
+      </w:r>
+      <w:r>
+        <w:t xml:space="preserve"> </w:t>
+      </w:r>
+      <w:r>
+        <w:t xml:space="preserve">demonstram, em aprendizado por reforço profundo, que a</w:t>
+      </w:r>
+      <w:r>
+        <w:t xml:space="preserve"> </w:t>
+      </w:r>
+      <w:r>
+        <w:t xml:space="preserve">variabilidade entre execuções que diferem apenas pela semente aleatória é frequentemente maior do</w:t>
+      </w:r>
+      <w:r>
+        <w:t xml:space="preserve"> </w:t>
+      </w:r>
+      <w:r>
+        <w:t xml:space="preserve">que a diferença de desempenho entre algoritmos distintos – a ponto de dois conjuntos de execuções</w:t>
+      </w:r>
+      <w:r>
+        <w:t xml:space="preserve"> </w:t>
+      </w:r>
+      <w:r>
+        <w:t xml:space="preserve">do</w:t>
+      </w:r>
+      <w:r>
+        <w:t xml:space="preserve"> </w:t>
+      </w:r>
+      <w:r>
+        <w:rPr>
+          <w:i/>
+          <w:iCs/>
+        </w:rPr>
+        <w:t xml:space="preserve">mesmo</w:t>
+      </w:r>
+      <w:r>
+        <w:t xml:space="preserve"> </w:t>
+      </w:r>
+      <w:r>
+        <w:t xml:space="preserve">algoritmo, separados apenas por sementes, produzirem curvas que, comparadas</w:t>
+      </w:r>
+      <w:r>
+        <w:t xml:space="preserve"> </w:t>
+      </w:r>
+      <w:r>
+        <w:t xml:space="preserve">ingenuamente, sugeririam superioridade de um sobre o outro. Transposto para a</w:t>
+      </w:r>
+      <w:r>
+        <w:t xml:space="preserve"> </w:t>
+      </w:r>
+      <w:r>
+        <w:t xml:space="preserve">Tabela </w:t>
+      </w:r>
+      <w:hyperlink w:anchor="_7e60257ab62ab0e0b551aceabf79f7a4db1451b">
+        <w:r>
+          <w:rPr>
+            <w:rStyle w:val="Hyperlink"/>
+          </w:rPr>
+          <w:t xml:space="preserve">2</w:t>
+        </w:r>
+      </w:hyperlink>
+      <w:r>
+        <w:t xml:space="preserve">, esse resultado implica que a margem observada entre</w:t>
+      </w:r>
+      <w:r>
+        <w:t xml:space="preserve"> </w:t>
+      </w:r>
+      <w:r>
+        <w:t xml:space="preserve">52,19 e 49,81 não pode ser atribuída ao hiperparâmetro sem que a variação intrínseca entre</w:t>
+      </w:r>
+      <w:r>
+        <w:t xml:space="preserve"> </w:t>
+      </w:r>
+      <w:r>
+        <w:t xml:space="preserve">execuções da</w:t>
+      </w:r>
+      <w:r>
+        <w:t xml:space="preserve"> </w:t>
+      </w:r>
+      <w:r>
+        <w:rPr>
+          <w:i/>
+          <w:iCs/>
+        </w:rPr>
+        <w:t xml:space="preserve">mesma</w:t>
+      </w:r>
+      <w:r>
+        <w:t xml:space="preserve"> </w:t>
+      </w:r>
+      <w:r>
+        <w:t xml:space="preserve">configuração seja medida primeiro, o que o desenho atual, com uma única</w:t>
+      </w:r>
+      <w:r>
+        <w:t xml:space="preserve"> </w:t>
+      </w:r>
+      <w:r>
+        <w:t xml:space="preserve">trajetória por célula, não permite fazer. formalizam essa</w:t>
+      </w:r>
+      <w:r>
+        <w:t xml:space="preserve"> </w:t>
+      </w:r>
+      <w:r>
+        <w:t xml:space="preserve">exigência em termos de poder estatístico e oferecem o procedimento para dimensionar o número de</w:t>
+      </w:r>
+      <w:r>
+        <w:t xml:space="preserve"> </w:t>
+      </w:r>
+      <w:r>
+        <w:t xml:space="preserve">repetições a partir do tamanho de efeito que se deseja detectar e da variância observada entre</w:t>
+      </w:r>
+      <w:r>
+        <w:t xml:space="preserve"> </w:t>
+      </w:r>
+      <w:r>
+        <w:t xml:space="preserve">execuções – procedimento que, aplicado a este experimento, é o caminho objetivo para substituir a</w:t>
+      </w:r>
+      <w:r>
+        <w:t xml:space="preserve"> </w:t>
+      </w:r>
+      <w:r>
+        <w:t xml:space="preserve">recomendação genérica de "mais sementes" por um número justificado de repetições por combinação.</w:t>
+      </w:r>
+      <w:r>
+        <w:t xml:space="preserve"> </w:t>
+      </w:r>
+      <w:r>
+        <w:t xml:space="preserve">Uma vez disponíveis essas repetições, a comparação entre as seis configurações deixa de ser uma</w:t>
+      </w:r>
+      <w:r>
+        <w:t xml:space="preserve"> </w:t>
+      </w:r>
+      <w:r>
+        <w:t xml:space="preserve">leitura direta da tabela e passa a exigir testes de hipótese adequados a distribuições de</w:t>
+      </w:r>
+      <w:r>
+        <w:t xml:space="preserve"> </w:t>
+      </w:r>
+      <w:r>
+        <w:t xml:space="preserve">desempenho não normais e a amostras pequenas, para os quais</w:t>
+      </w:r>
+      <w:r>
+        <w:t xml:space="preserve"> </w:t>
+      </w:r>
+      <w:r>
+        <w:t xml:space="preserve">fornecem o protocolo consolidado na literatura de computação</w:t>
+      </w:r>
+      <w:r>
+        <w:t xml:space="preserve"> </w:t>
+      </w:r>
+      <w:r>
+        <w:t xml:space="preserve">evolutiva – testes não paramétricos de comparação par a par e múltipla, com correção para</w:t>
+      </w:r>
+      <w:r>
+        <w:t xml:space="preserve"> </w:t>
+      </w:r>
+      <w:r>
+        <w:t xml:space="preserve">comparações simultâneas, aplicáveis diretamente a um arranjo fatorial como o aqui adotado.</w:t>
+      </w:r>
+    </w:p>
+    <w:p>
+      <w:pPr>
+        <w:pStyle w:val="BodyText"/>
+      </w:pPr>
+      <w:r>
+        <w:t xml:space="preserve">Vale registrar, por fim, uma ressalva sobre a própria natureza da pergunta respondida neste</w:t>
+      </w:r>
+      <w:r>
+        <w:t xml:space="preserve"> </w:t>
+      </w:r>
+      <w:r>
+        <w:t xml:space="preserve">experimento. argumenta que o</w:t>
+      </w:r>
+      <w:r>
+        <w:t xml:space="preserve"> </w:t>
+      </w:r>
+      <w:r>
+        <w:rPr>
+          <w:i/>
+          <w:iCs/>
+        </w:rPr>
+        <w:t xml:space="preserve">teste competitivo</w:t>
+      </w:r>
+      <w:r>
+        <w:t xml:space="preserve"> </w:t>
+      </w:r>
+      <w:r>
+        <w:t xml:space="preserve">– executar</w:t>
+      </w:r>
+      <w:r>
+        <w:t xml:space="preserve"> </w:t>
+      </w:r>
+      <w:r>
+        <w:t xml:space="preserve">configurações concorrentes e relatar qual venceu – é um instrumento fraco de conhecimento</w:t>
+      </w:r>
+      <w:r>
+        <w:t xml:space="preserve"> </w:t>
+      </w:r>
+      <w:r>
+        <w:t xml:space="preserve">científico, porque mede o desempenho conjunto de fatores que não foram isolados e não explica</w:t>
+      </w:r>
+      <w:r>
+        <w:t xml:space="preserve"> </w:t>
+      </w:r>
+      <w:r>
+        <w:rPr>
+          <w:i/>
+          <w:iCs/>
+        </w:rPr>
+        <w:t xml:space="preserve">por que</w:t>
+      </w:r>
+      <w:r>
+        <w:t xml:space="preserve"> </w:t>
+      </w:r>
+      <w:r>
+        <w:t xml:space="preserve">uma configuração se comporta como se comporta, devendo ser substituído, sempre</w:t>
+      </w:r>
+      <w:r>
+        <w:t xml:space="preserve"> </w:t>
+      </w:r>
+      <w:r>
+        <w:t xml:space="preserve">que possível, pelo experimento controlado que testa hipóteses sobre o mecanismo. Essa crítica se</w:t>
+      </w:r>
+      <w:r>
+        <w:t xml:space="preserve"> </w:t>
+      </w:r>
+      <w:r>
+        <w:t xml:space="preserve">aplica diretamente à leitura da Tabela </w:t>
+      </w:r>
+      <w:hyperlink w:anchor="_7e60257ab62ab0e0b551aceabf79f7a4db1451b">
+        <w:r>
+          <w:rPr>
+            <w:rStyle w:val="Hyperlink"/>
+          </w:rPr>
+          <w:t xml:space="preserve">2</w:t>
+        </w:r>
+      </w:hyperlink>
+      <w:r>
+        <w:t xml:space="preserve">: o experimento</w:t>
+      </w:r>
+      <w:r>
+        <w:t xml:space="preserve"> </w:t>
+      </w:r>
+      <w:r>
+        <w:t xml:space="preserve">compara desempenhos finais, mas não testa nenhuma hipótese sobre a causa do platô compartilhado –</w:t>
+      </w:r>
+      <w:r>
+        <w:t xml:space="preserve"> </w:t>
+      </w:r>
+      <w:r>
+        <w:t xml:space="preserve">embora uma hipótese mecânica concorrente e mais parcimoniosa para a coincidência exata de cinco</w:t>
+      </w:r>
+      <w:r>
+        <w:t xml:space="preserve"> </w:t>
+      </w:r>
+      <w:r>
+        <w:t xml:space="preserve">valores de fitness esteja disponível e não tenha sido investigada: o determinismo parcial do</w:t>
+      </w:r>
+      <w:r>
+        <w:t xml:space="preserve"> </w:t>
+      </w:r>
+      <w:r>
+        <w:t xml:space="preserve">próprio ambiente de avaliação, cujas sementes de episódio dependem apenas do número da geração e</w:t>
+      </w:r>
+      <w:r>
+        <w:t xml:space="preserve"> </w:t>
+      </w:r>
+      <w:r>
+        <w:t xml:space="preserve">cujos cenários roteirizados são idênticos entre as seis combinações, o que faz genomas</w:t>
+      </w:r>
+      <w:r>
+        <w:t xml:space="preserve"> </w:t>
+      </w:r>
+      <w:r>
+        <w:t xml:space="preserve">convergentes para a mesma estratégia percorrerem trajetórias idênticas. Distinguir essa hipótese</w:t>
+      </w:r>
+      <w:r>
+        <w:t xml:space="preserve"> </w:t>
+      </w:r>
+      <w:r>
+        <w:t xml:space="preserve">da convergência para um mesmo ótimo local exigiria um experimento controlado – variar as sementes</w:t>
+      </w:r>
+      <w:r>
+        <w:t xml:space="preserve"> </w:t>
+      </w:r>
+      <w:r>
+        <w:t xml:space="preserve">de avaliação por configuração, mantendo todo o resto fixo –, não uma nova rodada de teste</w:t>
+      </w:r>
+      <w:r>
+        <w:t xml:space="preserve"> </w:t>
+      </w:r>
+      <w:r>
+        <w:t xml:space="preserve">competitivo.</w:t>
+      </w:r>
+    </w:p>
+    <w:p>
+      <w:pPr>
+        <w:pStyle w:val="BodyText"/>
+      </w:pPr>
+      <w:r>
         <w:t xml:space="preserve">Com essas ressalvas, a conclusão prática deste experimento para a escolha de hiperparâmetros do</w:t>
       </w:r>
       <w:r>
@@ -4781,16 +5608,81 @@
       <w:r>
         <w:t xml:space="preserve">.</w:t>
       </w:r>
+      <w:r>
+        <w:t xml:space="preserve"> </w:t>
+      </w:r>
+      <w:r>
+        <w:t xml:space="preserve">Cabe explicitar, nos termos de , o que esse resultado não autoriza</w:t>
+      </w:r>
+      <w:r>
+        <w:t xml:space="preserve"> </w:t>
+      </w:r>
+      <w:r>
+        <w:t xml:space="preserve">concluir: a ausência, neste experimento, de uma configuração comprovadamente melhor não constitui</w:t>
+      </w:r>
+      <w:r>
+        <w:t xml:space="preserve"> </w:t>
+      </w:r>
+      <w:r>
+        <w:t xml:space="preserve">evidência positiva a favor da configuração já em produção. Com</w:t>
+      </w:r>
+      <w:r>
+        <w:t xml:space="preserve"> </w:t>
+      </w:r>
+      <m:oMath>
+        <m:r>
+          <m:t>n</m:t>
+        </m:r>
+        <m:r>
+          <m:rPr>
+            <m:sty m:val="p"/>
+          </m:rPr>
+          <m:t>=</m:t>
+        </m:r>
+        <m:r>
+          <m:t>1</m:t>
+        </m:r>
+      </m:oMath>
+      <w:r>
+        <w:t xml:space="preserve"> </w:t>
+      </w:r>
+      <w:r>
+        <w:t xml:space="preserve">por combinação, horizonte</w:t>
+      </w:r>
+      <w:r>
+        <w:t xml:space="preserve"> </w:t>
+      </w:r>
+      <w:r>
+        <w:t xml:space="preserve">curto de gerações e avaliação parcialmente determinística, o poder do experimento para detectar</w:t>
+      </w:r>
+      <w:r>
+        <w:t xml:space="preserve"> </w:t>
+      </w:r>
+      <w:r>
+        <w:t xml:space="preserve">uma diferença real é baixo, de modo que a configuração de produção permanece validada apenas por</w:t>
+      </w:r>
+      <w:r>
+        <w:t xml:space="preserve"> </w:t>
+      </w:r>
+      <w:r>
+        <w:t xml:space="preserve">não ter sido contestada – o que é um estado de conhecimento distinto, e mais fraco, do que ter</w:t>
+      </w:r>
+      <w:r>
+        <w:t xml:space="preserve"> </w:t>
+      </w:r>
+      <w:r>
+        <w:t xml:space="preserve">sido confirmada.</w:t>
+      </w:r>
     </w:p>
     <w:p>
       <w:pPr>
         <w:pStyle w:val="Heading2"/>
       </w:pPr>
-      <w:bookmarkStart w:id="37" w:name="_486fa9899c0f78d34a1f268e0b69fc61eae8b87"/>
+      <w:bookmarkStart w:id="30" w:name="_486fa9899c0f78d34a1f268e0b69fc61eae8b87"/>
       <w:r>
         <w:t xml:space="preserve">Diagrama de pacotes</w:t>
       </w:r>
-      <w:bookmarkEnd w:id="37"/>
+      <w:bookmarkEnd w:id="30"/>
     </w:p>
     <w:p>
       <w:pPr>
@@ -4925,18 +5817,18 @@
           <wp:inline>
             <wp:extent cx="5334000" cy="6402160"/>
             <wp:effectExtent b="0" l="0" r="0" t="0"/>
-            <wp:docPr descr="" title="" id="39" name="Picture"/>
+            <wp:docPr descr="" title="" id="32" name="Picture"/>
             <a:graphic>
               <a:graphicData uri="http://schemas.openxmlformats.org/drawingml/2006/picture">
                 <pic:pic>
                   <pic:nvPicPr>
-                    <pic:cNvPr descr="Diagrama_de_Pacotes.png" id="40" name="Picture"/>
+                    <pic:cNvPr descr="Diagrama_de_Pacotes.png" id="33" name="Picture"/>
                     <pic:cNvPicPr>
                       <a:picLocks noChangeArrowheads="1" noChangeAspect="1"/>
                     </pic:cNvPicPr>
                   </pic:nvPicPr>
                   <pic:blipFill>
-                    <a:blip r:embed="rId38"/>
+                    <a:blip r:embed="rId31"/>
                     <a:stretch>
                       <a:fillRect/>
                     </a:stretch>
@@ -5317,30 +6209,18 @@
       <w:pPr>
         <w:pStyle w:val="Heading2"/>
       </w:pPr>
-      <w:bookmarkStart w:id="41" w:name="_a9dfe2aaa1b7a692030aac1c105e37c4dd850c5"/>
+      <w:bookmarkStart w:id="34" w:name="_a9dfe2aaa1b7a692030aac1c105e37c4dd850c5"/>
       <w:r>
         <w:t xml:space="preserve">Modelo de dados</w:t>
       </w:r>
-      <w:bookmarkEnd w:id="41"/>
+      <w:bookmarkEnd w:id="34"/>
     </w:p>
     <w:p>
       <w:pPr>
         <w:pStyle w:val="FirstParagraph"/>
       </w:pPr>
       <w:r>
-        <w:t xml:space="preserve">A persistência do RadarTorres foi igualmente documentada por meio de um levantamento do modelo de</w:t>
-      </w:r>
-      <w:r>
-        <w:t xml:space="preserve"> </w:t>
-      </w:r>
-      <w:r>
-        <w:t xml:space="preserve">dados diretamente a partir do código-fonte já implementado. O protótipo não depende de um</w:t>
-      </w:r>
-      <w:r>
-        <w:t xml:space="preserve"> </w:t>
-      </w:r>
-      <w:r>
-        <w:t xml:space="preserve">servidor de banco de dados: utiliza</w:t>
+        <w:t xml:space="preserve">O protótipo não depende de um servidor de banco de dados externo: a persistência usa</w:t>
       </w:r>
       <w:r>
         <w:t xml:space="preserve"> </w:t>
@@ -5380,13 +6260,13 @@
         <w:t xml:space="preserve"> </w:t>
       </w:r>
       <w:r>
-        <w:t xml:space="preserve">na</w:t>
-      </w:r>
-      <w:r>
-        <w:t xml:space="preserve"> </w:t>
-      </w:r>
-      <w:r>
-        <w:t xml:space="preserve">pasta de dados do usuário), com</w:t>
+        <w:t xml:space="preserve">na pasta de</w:t>
+      </w:r>
+      <w:r>
+        <w:t xml:space="preserve"> </w:t>
+      </w:r>
+      <w:r>
+        <w:t xml:space="preserve">dados do usuário), com</w:t>
       </w:r>
       <w:r>
         <w:t xml:space="preserve"> </w:t>
@@ -5401,13 +6281,7 @@
         <w:t xml:space="preserve"> </w:t>
       </w:r>
       <w:r>
-        <w:t xml:space="preserve">garantindo chaves estrangeiras</w:t>
-      </w:r>
-      <w:r>
-        <w:t xml:space="preserve"> </w:t>
-      </w:r>
-      <w:r>
-        <w:t xml:space="preserve">reais –</w:t>
+        <w:t xml:space="preserve">garantindo chaves estrangeiras reais –</w:t>
       </w:r>
       <w:r>
         <w:t xml:space="preserve"> </w:t>
@@ -5419,7 +6293,19 @@
         <w:t xml:space="preserve"> </w:t>
       </w:r>
       <w:r>
-        <w:t xml:space="preserve">nota histórica adiante). O schema atual tem onze tabelas, listadas na Tabela </w:t>
+        <w:t xml:space="preserve">nota histórica adiante). O modelo de dados abaixo foi levantado diretamente do código-fonte já</w:t>
+      </w:r>
+      <w:r>
+        <w:t xml:space="preserve"> </w:t>
+      </w:r>
+      <w:r>
+        <w:t xml:space="preserve">implementado, não de um diagrama projetado antes da codificação. O schema atual tem onze tabelas,</w:t>
+      </w:r>
+      <w:r>
+        <w:t xml:space="preserve"> </w:t>
+      </w:r>
+      <w:r>
+        <w:t xml:space="preserve">listadas na Tabela </w:t>
       </w:r>
       <w:hyperlink w:anchor="_341738a343ac6a3715c393c7b100f1fd2f1f5ab">
         <w:r>
@@ -5491,14 +6377,14 @@
           <w:rPr>
             <w:rStyle w:val="Hyperlink"/>
           </w:rPr>
-          <w:t xml:space="preserve">2.3.5</w:t>
+          <w:t xml:space="preserve">2.3.4</w:t>
         </w:r>
       </w:hyperlink>
       <w:r>
         <w:t xml:space="preserve">) entre execuções.</w:t>
       </w:r>
     </w:p>
-    <w:bookmarkStart w:id="42" w:name="_341738a343ac6a3715c393c7b100f1fd2f1f5ab"/>
+    <w:bookmarkStart w:id="35" w:name="_341738a343ac6a3715c393c7b100f1fd2f1f5ab"/>
     <w:p>
       <w:pPr>
         <w:pStyle w:val="TableCaption"/>
@@ -5968,7 +6854,7 @@
         </w:tc>
       </w:tr>
     </w:tbl>
-    <w:bookmarkEnd w:id="42"/>
+    <w:bookmarkEnd w:id="35"/>
     <w:p>
       <w:pPr>
         <w:pStyle w:val="FirstParagraph"/>
@@ -6034,7 +6920,7 @@
         <w:t xml:space="preserve">entidade-relacionamento levantados a partir do código-fonte do projeto.</w:t>
       </w:r>
     </w:p>
-    <w:bookmarkStart w:id="46" w:name="_262b76719279ca6c0ff7304adffb50ca4b96150"/>
+    <w:bookmarkStart w:id="39" w:name="_262b76719279ca6c0ff7304adffb50ca4b96150"/>
     <w:p>
       <w:pPr>
         <w:pStyle w:val="CaptionedFigure"/>
@@ -6044,18 +6930,18 @@
           <wp:inline>
             <wp:extent cx="4533900" cy="4176455"/>
             <wp:effectExtent b="0" l="0" r="0" t="0"/>
-            <wp:docPr descr="" title="" id="44" name="Picture"/>
+            <wp:docPr descr="" title="" id="37" name="Picture"/>
             <a:graphic>
               <a:graphicData uri="http://schemas.openxmlformats.org/drawingml/2006/picture">
                 <pic:pic>
                   <pic:nvPicPr>
-                    <pic:cNvPr descr="DER_Usuarios_Modo_Preferencias.png" id="45" name="Picture"/>
+                    <pic:cNvPr descr="DER_Usuarios_Modo_Preferencias.png" id="38" name="Picture"/>
                     <pic:cNvPicPr>
                       <a:picLocks noChangeArrowheads="1" noChangeAspect="1"/>
                     </pic:cNvPicPr>
                   </pic:nvPicPr>
                   <pic:blipFill>
-                    <a:blip r:embed="rId43"/>
+                    <a:blip r:embed="rId36"/>
                     <a:stretch>
                       <a:fillRect/>
                     </a:stretch>
@@ -6132,8 +7018,8 @@
         <w:t xml:space="preserve">(dos autores).</w:t>
       </w:r>
     </w:p>
-    <w:bookmarkEnd w:id="46"/>
-    <w:bookmarkStart w:id="50" w:name="_0300f214585135f1e933d93ca28f64310a95f2e"/>
+    <w:bookmarkEnd w:id="39"/>
+    <w:bookmarkStart w:id="43" w:name="_0300f214585135f1e933d93ca28f64310a95f2e"/>
     <w:p>
       <w:pPr>
         <w:pStyle w:val="CaptionedFigure"/>
@@ -6143,18 +7029,18 @@
           <wp:inline>
             <wp:extent cx="5334000" cy="5019872"/>
             <wp:effectExtent b="0" l="0" r="0" t="0"/>
-            <wp:docPr descr="" title="" id="48" name="Picture"/>
+            <wp:docPr descr="" title="" id="41" name="Picture"/>
             <a:graphic>
               <a:graphicData uri="http://schemas.openxmlformats.org/drawingml/2006/picture">
                 <pic:pic>
                   <pic:nvPicPr>
-                    <pic:cNvPr descr="DER_Cameras_Objetos_Detectados.png" id="49" name="Picture"/>
+                    <pic:cNvPr descr="DER_Cameras_Objetos_Detectados.png" id="42" name="Picture"/>
                     <pic:cNvPicPr>
                       <a:picLocks noChangeArrowheads="1" noChangeAspect="1"/>
                     </pic:cNvPicPr>
                   </pic:nvPicPr>
                   <pic:blipFill>
-                    <a:blip r:embed="rId47"/>
+                    <a:blip r:embed="rId40"/>
                     <a:stretch>
                       <a:fillRect/>
                     </a:stretch>
@@ -6261,8 +7147,8 @@
         <w:t xml:space="preserve">autores).</w:t>
       </w:r>
     </w:p>
-    <w:bookmarkEnd w:id="50"/>
-    <w:bookmarkStart w:id="54" w:name="_1eaa75570fdfc487fe3144efd4f1a83ef457d14"/>
+    <w:bookmarkEnd w:id="43"/>
+    <w:bookmarkStart w:id="47" w:name="_1eaa75570fdfc487fe3144efd4f1a83ef457d14"/>
     <w:p>
       <w:pPr>
         <w:pStyle w:val="CaptionedFigure"/>
@@ -6272,18 +7158,18 @@
           <wp:inline>
             <wp:extent cx="5334000" cy="1746290"/>
             <wp:effectExtent b="0" l="0" r="0" t="0"/>
-            <wp:docPr descr="" title="" id="52" name="Picture"/>
+            <wp:docPr descr="" title="" id="45" name="Picture"/>
             <a:graphic>
               <a:graphicData uri="http://schemas.openxmlformats.org/drawingml/2006/picture">
                 <pic:pic>
                   <pic:nvPicPr>
-                    <pic:cNvPr descr="DER_Tabelas_Treinamento.png" id="53" name="Picture"/>
+                    <pic:cNvPr descr="DER_Tabelas_Treinamento.png" id="46" name="Picture"/>
                     <pic:cNvPicPr>
                       <a:picLocks noChangeArrowheads="1" noChangeAspect="1"/>
                     </pic:cNvPicPr>
                   </pic:nvPicPr>
                   <pic:blipFill>
-                    <a:blip r:embed="rId51"/>
+                    <a:blip r:embed="rId44"/>
                     <a:stretch>
                       <a:fillRect/>
                     </a:stretch>
@@ -6360,7 +7246,7 @@
         <w:t xml:space="preserve">(dos autores).</w:t>
       </w:r>
     </w:p>
-    <w:bookmarkEnd w:id="54"/>
+    <w:bookmarkEnd w:id="47"/>
     <w:p>
       <w:pPr>
         <w:pStyle w:val="FirstParagraph"/>
@@ -6741,11 +7627,11 @@
       <w:pPr>
         <w:pStyle w:val="Heading1"/>
       </w:pPr>
-      <w:bookmarkStart w:id="55" w:name="_conclusão"/>
+      <w:bookmarkStart w:id="48" w:name="_conclusão"/>
       <w:r>
         <w:t xml:space="preserve">Conclusão</w:t>
       </w:r>
-      <w:bookmarkEnd w:id="55"/>
+      <w:bookmarkEnd w:id="48"/>
     </w:p>
     <w:p>
       <w:pPr>
@@ -6932,37 +7818,28 @@
         <w:t xml:space="preserve"> </w:t>
       </w:r>
       <w:r>
-        <w:t xml:space="preserve">resultados de</w:t>
-      </w:r>
-      <w:r>
-        <w:t xml:space="preserve"> </w:t>
-      </w:r>
-      <w:r>
-        <w:t xml:space="preserve">Such et al. (2017)</w:t>
-      </w:r>
-      <w:r>
-        <w:t xml:space="preserve">.</w:t>
+        <w:t xml:space="preserve">resultados de .</w:t>
       </w:r>
     </w:p>
     <w:p>
       <w:pPr>
         <w:pStyle w:val="Heading1"/>
       </w:pPr>
-      <w:bookmarkStart w:id="56" w:name="_a61d39fce7203a96daf18ede2aa2e879c4fd489"/>
+      <w:bookmarkStart w:id="49" w:name="_a61d39fce7203a96daf18ede2aa2e879c4fd489"/>
       <w:r>
         <w:t xml:space="preserve">Parecer final da banca (Banca_TCC, revisão automatizada desta versão)</w:t>
       </w:r>
-      <w:bookmarkEnd w:id="56"/>
+      <w:bookmarkEnd w:id="49"/>
     </w:p>
     <w:p>
       <w:pPr>
         <w:pStyle w:val="Heading2"/>
       </w:pPr>
-      <w:bookmarkStart w:id="57" w:name="_97581fc511109b4312171f7e9a01f88ccebaeea"/>
+      <w:bookmarkStart w:id="50" w:name="_97581fc511109b4312171f7e9a01f88ccebaeea"/>
       <w:r>
         <w:t xml:space="preserve">Nota geral</w:t>
       </w:r>
-      <w:bookmarkEnd w:id="57"/>
+      <w:bookmarkEnd w:id="50"/>
     </w:p>
     <w:p>
       <w:pPr>
@@ -7020,11 +7897,11 @@
       <w:pPr>
         <w:pStyle w:val="Heading2"/>
       </w:pPr>
-      <w:bookmarkStart w:id="58" w:name="_97d1f99c81acaf017c9724de9f2b653ae7d7076"/>
+      <w:bookmarkStart w:id="51" w:name="_97d1f99c81acaf017c9724de9f2b653ae7d7076"/>
       <w:r>
         <w:t xml:space="preserve">Coerência geral</w:t>
       </w:r>
-      <w:bookmarkEnd w:id="58"/>
+      <w:bookmarkEnd w:id="51"/>
     </w:p>
     <w:p>
       <w:pPr>
@@ -7170,11 +8047,11 @@
       <w:pPr>
         <w:pStyle w:val="Heading2"/>
       </w:pPr>
-      <w:bookmarkStart w:id="59" w:name="_03ae223b23867f8cd7ac2efcdecf0ea80a61467"/>
+      <w:bookmarkStart w:id="52" w:name="_03ae223b23867f8cd7ac2efcdecf0ea80a61467"/>
       <w:r>
         <w:t xml:space="preserve">Plano de correção priorizado</w:t>
       </w:r>
-      <w:bookmarkEnd w:id="59"/>
+      <w:bookmarkEnd w:id="52"/>
     </w:p>
     <w:tbl>
       <w:tblPr>
@@ -7683,15 +8560,15 @@
         <w:t xml:space="preserve">, gerado na mesma análise que originou estas marcações.</w:t>
       </w:r>
     </w:p>
-    <w:bookmarkStart w:id="74" w:name="_refs"/>
-    <w:bookmarkStart w:id="61" w:name="_049f91689c1a694accda2e77012fa26aa2e9134"/>
+    <w:bookmarkStart w:id="63" w:name="_refs"/>
+    <w:bookmarkStart w:id="54" w:name="_017a962bbba5e4ba83c93745e576eb309d6f797"/>
     <w:p>
       <w:pPr>
         <w:pStyle w:val="Bibliography"/>
         <w:ind w:left="720" w:hanging="720"/>
       </w:pPr>
       <w:r>
-        <w:t xml:space="preserve">Alshiekh, Mohammed, Roderick Bloem, Rüdiger Ehlers, Bettina Könighofer, Scott Niekum, and Ufuk Topcu. 2017.</w:t>
+        <w:t xml:space="preserve">Baek, Iljoo, Tzu-Chieh Tai, Manoj Mohan Bhat, et al. 2020.</w:t>
       </w:r>
       <w:r>
         <w:t xml:space="preserve"> </w:t>
@@ -7701,7 +8578,7 @@
           <w:i/>
           <w:iCs/>
         </w:rPr>
-        <w:t xml:space="preserve">Safe Reinforcement Learning via Shielding</w:t>
+        <w:t xml:space="preserve">CurbScan: Curb Detection and Tracking Using Multi-Sensor Fusion</w:t>
       </w:r>
       <w:r>
         <w:t xml:space="preserve">.</w:t>
@@ -7709,45 +8586,7 @@
       <w:r>
         <w:t xml:space="preserve"> </w:t>
       </w:r>
-      <w:hyperlink r:id="rId60">
-        <w:r>
-          <w:rPr>
-            <w:rStyle w:val="Hyperlink"/>
-          </w:rPr>
-          <w:t xml:space="preserve">https://arxiv.org/abs/1708.08611</w:t>
-        </w:r>
-      </w:hyperlink>
-      <w:r>
-        <w:t xml:space="preserve">.</w:t>
-      </w:r>
-    </w:p>
-    <w:bookmarkEnd w:id="61"/>
-    <w:bookmarkStart w:id="63" w:name="_017a962bbba5e4ba83c93745e576eb309d6f797"/>
-    <w:p>
-      <w:pPr>
-        <w:pStyle w:val="Bibliography"/>
-        <w:ind w:left="720" w:hanging="720"/>
-      </w:pPr>
-      <w:r>
-        <w:t xml:space="preserve">Baek, Iljoo, Tzu-Chieh Tai, Manoj Mohan Bhat, et al. 2020.</w:t>
-      </w:r>
-      <w:r>
-        <w:t xml:space="preserve"> </w:t>
-      </w:r>
-      <w:r>
-        <w:rPr>
-          <w:i/>
-          <w:iCs/>
-        </w:rPr>
-        <w:t xml:space="preserve">CurbScan: Curb Detection and Tracking Using Multi-Sensor Fusion</w:t>
-      </w:r>
-      <w:r>
-        <w:t xml:space="preserve">.</w:t>
-      </w:r>
-      <w:r>
-        <w:t xml:space="preserve"> </w:t>
-      </w:r>
-      <w:hyperlink r:id="rId62">
+      <w:hyperlink r:id="rId53">
         <w:r>
           <w:rPr>
             <w:rStyle w:val="Hyperlink"/>
@@ -7759,15 +8598,21 @@
         <w:t xml:space="preserve">.</w:t>
       </w:r>
     </w:p>
-    <w:bookmarkEnd w:id="63"/>
-    <w:bookmarkStart w:id="65" w:name="_dabbdc31ee083fe1212ea91bb9a0fb91f7229dc"/>
+    <w:bookmarkEnd w:id="54"/>
+    <w:bookmarkStart w:id="56" w:name="_a87cabb3e917760088615513f0bf876ba1185a1"/>
     <w:p>
       <w:pPr>
         <w:pStyle w:val="Bibliography"/>
         <w:ind w:left="720" w:hanging="720"/>
       </w:pPr>
       <w:r>
-        <w:t xml:space="preserve">Huang, Shengyi, and Santiago Ontañón. 2020.</w:t>
+        <w:t xml:space="preserve">Majoni, Leeroy, Stefan van Aardt, Farouk Smith, and Shahrokh Hatefi. 2025.</w:t>
+      </w:r>
+      <w:r>
+        <w:t xml:space="preserve"> </w:t>
+      </w:r>
+      <w:r>
+        <w:t xml:space="preserve">“Camera and Ultrasonic Sensor Fusion for Electronic Travel Aid: Design and Performance Analysis.”</w:t>
       </w:r>
       <w:r>
         <w:t xml:space="preserve"> </w:t>
@@ -7777,50 +8622,6 @@
           <w:i/>
           <w:iCs/>
         </w:rPr>
-        <w:t xml:space="preserve">A Closer Look at Invalid Action Masking in Policy Gradient Algorithms</w:t>
-      </w:r>
-      <w:r>
-        <w:t xml:space="preserve">.</w:t>
-      </w:r>
-      <w:r>
-        <w:t xml:space="preserve"> </w:t>
-      </w:r>
-      <w:hyperlink r:id="rId64">
-        <w:r>
-          <w:rPr>
-            <w:rStyle w:val="Hyperlink"/>
-          </w:rPr>
-          <w:t xml:space="preserve">https://arxiv.org/abs/2006.14171</w:t>
-        </w:r>
-      </w:hyperlink>
-      <w:r>
-        <w:t xml:space="preserve">.</w:t>
-      </w:r>
-    </w:p>
-    <w:bookmarkEnd w:id="65"/>
-    <w:bookmarkStart w:id="67" w:name="_a87cabb3e917760088615513f0bf876ba1185a1"/>
-    <w:p>
-      <w:pPr>
-        <w:pStyle w:val="Bibliography"/>
-        <w:ind w:left="720" w:hanging="720"/>
-      </w:pPr>
-      <w:r>
-        <w:t xml:space="preserve">Majoni, Leeroy, Stefan van Aardt, Farouk Smith, and Shahrokh Hatefi. 2025.</w:t>
-      </w:r>
-      <w:r>
-        <w:t xml:space="preserve"> </w:t>
-      </w:r>
-      <w:r>
-        <w:t xml:space="preserve">“Camera and Ultrasonic Sensor Fusion for Electronic Travel Aid: Design and Performance Analysis.”</w:t>
-      </w:r>
-      <w:r>
-        <w:t xml:space="preserve"> </w:t>
-      </w:r>
-      <w:r>
-        <w:rPr>
-          <w:i/>
-          <w:iCs/>
-        </w:rPr>
         <w:t xml:space="preserve">MATEC Web of Conferences</w:t>
       </w:r>
       <w:r>
@@ -7832,7 +8633,7 @@
       <w:r>
         <w:t xml:space="preserve"> </w:t>
       </w:r>
-      <w:hyperlink r:id="rId66">
+      <w:hyperlink r:id="rId55">
         <w:r>
           <w:rPr>
             <w:rStyle w:val="Hyperlink"/>
@@ -7844,8 +8645,8 @@
         <w:t xml:space="preserve">.</w:t>
       </w:r>
     </w:p>
-    <w:bookmarkEnd w:id="67"/>
-    <w:bookmarkStart w:id="69" w:name="_958467714e5f88c1dc8113ffde245624df1a09c"/>
+    <w:bookmarkEnd w:id="56"/>
+    <w:bookmarkStart w:id="58" w:name="_958467714e5f88c1dc8113ffde245624df1a09c"/>
     <w:p>
       <w:pPr>
         <w:pStyle w:val="Bibliography"/>
@@ -7870,7 +8671,7 @@
       <w:r>
         <w:t xml:space="preserve"> </w:t>
       </w:r>
-      <w:hyperlink r:id="rId68">
+      <w:hyperlink r:id="rId57">
         <w:r>
           <w:rPr>
             <w:rStyle w:val="Hyperlink"/>
@@ -7882,8 +8683,8 @@
         <w:t xml:space="preserve">.</w:t>
       </w:r>
     </w:p>
-    <w:bookmarkEnd w:id="69"/>
-    <w:bookmarkStart w:id="71" w:name="_f017af51ad974aa4fd21aaf257ad1c283aff8cb"/>
+    <w:bookmarkEnd w:id="58"/>
+    <w:bookmarkStart w:id="60" w:name="_f017af51ad974aa4fd21aaf257ad1c283aff8cb"/>
     <w:p>
       <w:pPr>
         <w:pStyle w:val="Bibliography"/>
@@ -7908,7 +8709,7 @@
       <w:r>
         <w:t xml:space="preserve"> </w:t>
       </w:r>
-      <w:hyperlink r:id="rId70">
+      <w:hyperlink r:id="rId59">
         <w:r>
           <w:rPr>
             <w:rStyle w:val="Hyperlink"/>
@@ -7920,15 +8721,15 @@
         <w:t xml:space="preserve">.</w:t>
       </w:r>
     </w:p>
-    <w:bookmarkEnd w:id="71"/>
-    <w:bookmarkStart w:id="73" w:name="_7ee9973f7784d096212ce4f377c878d6c5b4ad6"/>
+    <w:bookmarkEnd w:id="60"/>
+    <w:bookmarkStart w:id="62" w:name="_de8c6622f26dd0d3922c3aaeba35afcffcb8ce0"/>
     <w:p>
       <w:pPr>
         <w:pStyle w:val="Bibliography"/>
         <w:ind w:left="720" w:hanging="720"/>
       </w:pPr>
       <w:r>
-        <w:t xml:space="preserve">Such, Felipe Petroski, Vashisht Madhavan, Edoardo Conti, Joel Lehman, Kenneth O. Stanley, and Jeff Clune. 2017.</w:t>
+        <w:t xml:space="preserve">Ultralytics. 2025.</w:t>
       </w:r>
       <w:r>
         <w:t xml:space="preserve"> </w:t>
@@ -7938,7 +8739,14 @@
           <w:i/>
           <w:iCs/>
         </w:rPr>
-        <w:t xml:space="preserve">Deep Neuroevolution: Genetic Algorithms Are a Competitive Alternative for Training Deep Neural Networks for Reinforcement Learning</w:t>
+        <w:t xml:space="preserve">YOLO26</w:t>
+      </w:r>
+      <w:r>
+        <w:rPr>
+          <w:i/>
+          <w:iCs/>
+        </w:rPr>
+        <w:t xml:space="preserve">: Model Documentation</w:t>
       </w:r>
       <w:r>
         <w:t xml:space="preserve">.</w:t>
@@ -7946,20 +8754,20 @@
       <w:r>
         <w:t xml:space="preserve"> </w:t>
       </w:r>
-      <w:hyperlink r:id="rId72">
+      <w:hyperlink r:id="rId61">
         <w:r>
           <w:rPr>
             <w:rStyle w:val="Hyperlink"/>
           </w:rPr>
-          <w:t xml:space="preserve">https://arxiv.org/abs/1712.06567</w:t>
+          <w:t xml:space="preserve">Https://docs.ultralytics.com/models/yolo26/</w:t>
         </w:r>
       </w:hyperlink>
       <w:r>
         <w:t xml:space="preserve">.</w:t>
       </w:r>
     </w:p>
-    <w:bookmarkEnd w:id="73"/>
-    <w:bookmarkEnd w:id="74"/>
+    <w:bookmarkEnd w:id="62"/>
+    <w:bookmarkEnd w:id="63"/>
     <w:sectPr>
       <w:footnotePr>
         <w:numRestart w:val="eachSect"/>

</xml_diff>